<commit_message>
docs: add documentation for data fields and contract template sample
</commit_message>
<xml_diff>
--- a/backend-app/samples/phu_luc_hop_dong.docx
+++ b/backend-app/samples/phu_luc_hop_dong.docx
@@ -11,8 +11,6 @@
           <w:lang w:val="en-US"/>
         </w:rPr>
       </w:pPr>
-      <w:bookmarkStart w:id="1" w:name="_GoBack"/>
-      <w:bookmarkEnd w:id="1"/>
     </w:p>
     <w:p>
       <w:pPr>
@@ -182,7 +180,7 @@
     </w:p>
     <w:p>
       <w:pPr>
-        <w:pStyle w:val="8"/>
+        <w:pStyle w:val="9"/>
         <w:tabs>
           <w:tab w:val="center" w:pos="5043"/>
           <w:tab w:val="right" w:pos="10086"/>
@@ -247,10 +245,13 @@
       </w:r>
       <w:r>
         <w:rPr>
-          <w:lang w:val="en-US"/>
-        </w:rPr>
-        <w:t>……………..</w:t>
-      </w:r>
+          <w:rFonts w:hint="default"/>
+          <w:lang w:val="en-US"/>
+        </w:rPr>
+        <w:t>{SoPhuLuc}</w:t>
+      </w:r>
+      <w:bookmarkStart w:id="1" w:name="_GoBack"/>
+      <w:bookmarkEnd w:id="1"/>
     </w:p>
     <w:p>
       <w:pPr>
@@ -279,7 +280,15 @@
           <w:spacing w:val="62"/>
           <w:lang w:val="en-US"/>
         </w:rPr>
-        <w:t xml:space="preserve"> ………….</w:t>
+        <w:t xml:space="preserve"> </w:t>
+      </w:r>
+      <w:r>
+        <w:rPr>
+          <w:rFonts w:hint="default"/>
+          <w:spacing w:val="62"/>
+          <w:lang w:val="en-US"/>
+        </w:rPr>
+        <w:t>{Sohopdong}</w:t>
       </w:r>
       <w:r>
         <w:t>ký</w:t>
@@ -301,12 +310,20 @@
           <w:spacing w:val="-2"/>
           <w:lang w:val="en-US"/>
         </w:rPr>
-        <w:t xml:space="preserve"> …………………</w:t>
-      </w:r>
-    </w:p>
-    <w:p>
-      <w:pPr>
-        <w:pStyle w:val="12"/>
+        <w:t xml:space="preserve"> </w:t>
+      </w:r>
+      <w:r>
+        <w:rPr>
+          <w:rFonts w:hint="default"/>
+          <w:spacing w:val="-2"/>
+          <w:lang w:val="en-US"/>
+        </w:rPr>
+        <w:t>{NgayLapHD}/{ThangLapHD}/{NamLapHD}</w:t>
+      </w:r>
+    </w:p>
+    <w:p>
+      <w:pPr>
+        <w:pStyle w:val="13"/>
         <w:numPr>
           <w:ilvl w:val="0"/>
           <w:numId w:val="1"/>
@@ -377,7 +394,7 @@
     </w:p>
     <w:p>
       <w:pPr>
-        <w:pStyle w:val="12"/>
+        <w:pStyle w:val="13"/>
         <w:numPr>
           <w:ilvl w:val="0"/>
           <w:numId w:val="1"/>
@@ -448,7 +465,7 @@
     </w:p>
     <w:p>
       <w:pPr>
-        <w:pStyle w:val="12"/>
+        <w:pStyle w:val="13"/>
         <w:numPr>
           <w:ilvl w:val="0"/>
           <w:numId w:val="1"/>
@@ -710,45 +727,40 @@
       </w:r>
       <w:r>
         <w:rPr>
-          <w:b/>
+          <w:rFonts w:hint="default"/>
+          <w:b w:val="0"/>
+          <w:bCs/>
           <w:i/>
           <w:sz w:val="24"/>
           <w:lang w:val="en-US"/>
         </w:rPr>
-        <w:t>…….</w:t>
-      </w:r>
-      <w:r>
-        <w:rPr>
-          <w:b/>
+        <w:t xml:space="preserve">{NgayLapPL} </w:t>
+      </w:r>
+      <w:r>
+        <w:rPr>
           <w:i/>
-          <w:spacing w:val="-1"/>
-          <w:sz w:val="24"/>
-        </w:rPr>
-        <w:t xml:space="preserve"> </w:t>
-      </w:r>
-      <w:r>
-        <w:rPr>
+          <w:sz w:val="24"/>
+        </w:rPr>
+        <w:t>Tháng</w:t>
+      </w:r>
+      <w:r>
+        <w:rPr>
+          <w:rFonts w:hint="default"/>
           <w:i/>
           <w:sz w:val="24"/>
-        </w:rPr>
-        <w:t>Tháng</w:t>
-      </w:r>
-      <w:r>
-        <w:rPr>
+          <w:lang w:val="en-US"/>
+        </w:rPr>
+        <w:t xml:space="preserve"> </w:t>
+      </w:r>
+      <w:r>
+        <w:rPr>
+          <w:rFonts w:hint="default"/>
           <w:i/>
           <w:spacing w:val="2"/>
           <w:sz w:val="24"/>
           <w:lang w:val="en-US"/>
         </w:rPr>
-        <w:t>…….</w:t>
-      </w:r>
-      <w:r>
-        <w:rPr>
-          <w:b/>
-          <w:i/>
-          <w:sz w:val="24"/>
-        </w:rPr>
-        <w:t xml:space="preserve"> </w:t>
+        <w:t xml:space="preserve">{ThangLapPL} </w:t>
       </w:r>
       <w:r>
         <w:rPr>
@@ -767,17 +779,27 @@
       </w:r>
       <w:r>
         <w:rPr>
+          <w:rFonts w:hint="default"/>
           <w:i/>
           <w:spacing w:val="-2"/>
           <w:sz w:val="24"/>
           <w:lang w:val="en-US"/>
         </w:rPr>
-        <w:t>………….,</w:t>
-      </w:r>
-      <w:r>
-        <w:rPr>
-          <w:b/>
+        <w:t>{NamLapPL}</w:t>
+      </w:r>
+      <w:r>
+        <w:rPr>
           <w:i/>
+          <w:spacing w:val="-2"/>
+          <w:sz w:val="24"/>
+          <w:lang w:val="en-US"/>
+        </w:rPr>
+        <w:t>,</w:t>
+      </w:r>
+      <w:r>
+        <w:rPr>
+          <w:b/>
+          <w:i/>
           <w:sz w:val="24"/>
         </w:rPr>
         <w:t xml:space="preserve"> </w:t>
@@ -821,6 +843,288 @@
         </w:rPr>
         <w:t>đây:</w:t>
       </w:r>
+    </w:p>
+    <w:p>
+      <w:pPr>
+        <w:spacing w:before="120" w:after="120" w:line="276" w:lineRule="auto"/>
+        <w:ind w:firstLine="360" w:firstLineChars="150"/>
+        <w:jc w:val="both"/>
+        <w:rPr>
+          <w:b/>
+          <w:sz w:val="24"/>
+          <w:szCs w:val="24"/>
+          <w:lang w:val="en-US"/>
+        </w:rPr>
+      </w:pPr>
+      <w:r>
+        <w:rPr>
+          <w:b/>
+          <w:sz w:val="24"/>
+          <w:szCs w:val="24"/>
+        </w:rPr>
+        <w:t xml:space="preserve">BÊN A: </w:t>
+      </w:r>
+      <w:r>
+        <w:rPr>
+          <w:b/>
+          <w:sz w:val="24"/>
+          <w:szCs w:val="24"/>
+        </w:rPr>
+        <w:tab/>
+      </w:r>
+      <w:r>
+        <w:rPr>
+          <w:b/>
+          <w:sz w:val="24"/>
+          <w:szCs w:val="24"/>
+        </w:rPr>
+        <w:tab/>
+      </w:r>
+      <w:r>
+        <w:rPr>
+          <w:rFonts w:hint="default"/>
+          <w:b/>
+          <w:sz w:val="24"/>
+          <w:szCs w:val="24"/>
+          <w:lang w:val="en-US"/>
+        </w:rPr>
+        <w:t>{BenATenCongTy}</w:t>
+      </w:r>
+    </w:p>
+    <w:p>
+      <w:pPr>
+        <w:spacing w:before="120" w:after="120" w:line="276" w:lineRule="auto"/>
+        <w:ind w:left="360"/>
+        <w:jc w:val="both"/>
+        <w:rPr>
+          <w:rFonts w:hint="default"/>
+          <w:sz w:val="24"/>
+          <w:szCs w:val="24"/>
+        </w:rPr>
+      </w:pPr>
+      <w:r>
+        <w:rPr>
+          <w:sz w:val="24"/>
+          <w:szCs w:val="24"/>
+        </w:rPr>
+        <w:t>Địa Chỉ</w:t>
+      </w:r>
+      <w:r>
+        <w:rPr>
+          <w:sz w:val="24"/>
+          <w:szCs w:val="24"/>
+        </w:rPr>
+        <w:tab/>
+      </w:r>
+      <w:r>
+        <w:rPr>
+          <w:sz w:val="24"/>
+          <w:szCs w:val="24"/>
+        </w:rPr>
+        <w:tab/>
+      </w:r>
+      <w:r>
+        <w:rPr>
+          <w:rFonts w:hint="default"/>
+          <w:sz w:val="24"/>
+          <w:szCs w:val="24"/>
+        </w:rPr>
+        <w:t>{BenADiaChi}</w:t>
+      </w:r>
+    </w:p>
+    <w:p>
+      <w:pPr>
+        <w:spacing w:before="120" w:after="120" w:line="276" w:lineRule="auto"/>
+        <w:ind w:left="360"/>
+        <w:jc w:val="both"/>
+        <w:rPr>
+          <w:sz w:val="24"/>
+          <w:szCs w:val="24"/>
+        </w:rPr>
+      </w:pPr>
+      <w:r>
+        <w:rPr>
+          <w:sz w:val="24"/>
+          <w:szCs w:val="24"/>
+        </w:rPr>
+        <w:t>Điện thoại</w:t>
+      </w:r>
+      <w:r>
+        <w:rPr>
+          <w:sz w:val="24"/>
+          <w:szCs w:val="24"/>
+        </w:rPr>
+        <w:tab/>
+      </w:r>
+      <w:r>
+        <w:rPr>
+          <w:sz w:val="24"/>
+          <w:szCs w:val="24"/>
+        </w:rPr>
+        <w:tab/>
+      </w:r>
+      <w:r>
+        <w:rPr>
+          <w:rFonts w:hint="default"/>
+          <w:sz w:val="24"/>
+          <w:szCs w:val="24"/>
+        </w:rPr>
+        <w:t>{BenASDT}</w:t>
+      </w:r>
+    </w:p>
+    <w:p>
+      <w:pPr>
+        <w:spacing w:before="120" w:after="120" w:line="276" w:lineRule="auto"/>
+        <w:ind w:left="360"/>
+        <w:jc w:val="both"/>
+        <w:rPr>
+          <w:rFonts w:hint="default"/>
+          <w:b/>
+          <w:sz w:val="24"/>
+          <w:szCs w:val="24"/>
+          <w:lang w:val="en-US"/>
+        </w:rPr>
+      </w:pPr>
+      <w:r>
+        <w:rPr>
+          <w:b/>
+          <w:sz w:val="24"/>
+          <w:szCs w:val="24"/>
+        </w:rPr>
+        <w:t>Đại Diện:</w:t>
+      </w:r>
+      <w:r>
+        <w:rPr>
+          <w:b/>
+          <w:sz w:val="24"/>
+          <w:szCs w:val="24"/>
+        </w:rPr>
+        <w:tab/>
+      </w:r>
+      <w:r>
+        <w:rPr>
+          <w:b/>
+          <w:sz w:val="24"/>
+          <w:szCs w:val="24"/>
+        </w:rPr>
+        <w:tab/>
+      </w:r>
+      <w:r>
+        <w:rPr>
+          <w:rFonts w:hint="default"/>
+          <w:b/>
+          <w:sz w:val="24"/>
+          <w:szCs w:val="24"/>
+        </w:rPr>
+        <w:t>{BenADaiDien}</w:t>
+      </w:r>
+      <w:r>
+        <w:rPr>
+          <w:b/>
+          <w:sz w:val="24"/>
+          <w:szCs w:val="24"/>
+        </w:rPr>
+        <w:tab/>
+      </w:r>
+      <w:r>
+        <w:rPr>
+          <w:b/>
+          <w:sz w:val="24"/>
+          <w:szCs w:val="24"/>
+          <w:lang w:val="en-US"/>
+        </w:rPr>
+        <w:tab/>
+      </w:r>
+      <w:r>
+        <w:rPr>
+          <w:b/>
+          <w:sz w:val="24"/>
+          <w:szCs w:val="24"/>
+          <w:lang w:val="en-US"/>
+        </w:rPr>
+        <w:t xml:space="preserve">Chức vụ: </w:t>
+      </w:r>
+      <w:r>
+        <w:rPr>
+          <w:rFonts w:hint="default"/>
+          <w:b/>
+          <w:sz w:val="24"/>
+          <w:szCs w:val="24"/>
+          <w:lang w:val="en-US"/>
+        </w:rPr>
+        <w:t>{BenAChucVu}</w:t>
+      </w:r>
+    </w:p>
+    <w:p>
+      <w:pPr>
+        <w:spacing w:before="120" w:after="120" w:line="276" w:lineRule="auto"/>
+        <w:ind w:left="360"/>
+        <w:jc w:val="both"/>
+        <w:rPr>
+          <w:b/>
+          <w:bCs/>
+          <w:sz w:val="24"/>
+          <w:szCs w:val="24"/>
+          <w:lang w:val="en-US"/>
+        </w:rPr>
+      </w:pPr>
+      <w:r>
+        <w:rPr>
+          <w:sz w:val="24"/>
+          <w:szCs w:val="24"/>
+        </w:rPr>
+        <w:t xml:space="preserve">Nhân viên Phụ Trách: </w:t>
+      </w:r>
+      <w:r>
+        <w:rPr>
+          <w:rFonts w:hint="default"/>
+          <w:b w:val="0"/>
+          <w:bCs w:val="0"/>
+          <w:sz w:val="24"/>
+          <w:szCs w:val="24"/>
+          <w:lang w:val="en-US"/>
+        </w:rPr>
+        <w:t>{BenANhanVienPhuTrach}</w:t>
+      </w:r>
+      <w:r>
+        <w:rPr>
+          <w:b/>
+          <w:sz w:val="24"/>
+          <w:szCs w:val="24"/>
+        </w:rPr>
+        <w:t xml:space="preserve"> </w:t>
+      </w:r>
+      <w:r>
+        <w:rPr>
+          <w:sz w:val="24"/>
+          <w:szCs w:val="24"/>
+        </w:rPr>
+        <w:t xml:space="preserve">Số ĐT: </w:t>
+      </w:r>
+      <w:r>
+        <w:rPr>
+          <w:rFonts w:hint="default"/>
+          <w:b w:val="0"/>
+          <w:bCs/>
+          <w:sz w:val="24"/>
+          <w:szCs w:val="24"/>
+          <w:lang w:val="en-US"/>
+        </w:rPr>
+        <w:t>{BenASDTNhanVien}</w:t>
+      </w:r>
+    </w:p>
+    <w:p>
+      <w:pPr>
+        <w:spacing w:before="120" w:after="120" w:line="276" w:lineRule="auto"/>
+        <w:jc w:val="both"/>
+        <w:rPr>
+          <w:rFonts w:hint="default"/>
+          <w:b/>
+          <w:sz w:val="24"/>
+          <w:szCs w:val="24"/>
+          <w:lang w:val="en-US"/>
+        </w:rPr>
+      </w:pPr>
     </w:p>
     <w:p>
       <w:pPr>
@@ -828,229 +1132,8 @@
         <w:ind w:firstLine="360"/>
         <w:jc w:val="both"/>
         <w:rPr>
-          <w:b/>
-          <w:sz w:val="24"/>
-          <w:szCs w:val="24"/>
-          <w:lang w:val="en-US"/>
-        </w:rPr>
-      </w:pPr>
-      <w:r>
-        <w:rPr>
-          <w:b/>
-          <w:sz w:val="24"/>
-          <w:szCs w:val="24"/>
-        </w:rPr>
-        <w:t xml:space="preserve">BÊN A: </w:t>
-      </w:r>
-      <w:r>
-        <w:rPr>
-          <w:b/>
-          <w:sz w:val="24"/>
-          <w:szCs w:val="24"/>
-        </w:rPr>
-        <w:tab/>
-      </w:r>
-      <w:r>
-        <w:rPr>
-          <w:b/>
-          <w:sz w:val="24"/>
-          <w:szCs w:val="24"/>
-        </w:rPr>
-        <w:tab/>
-      </w:r>
-      <w:r>
-        <w:rPr>
-          <w:b/>
-          <w:sz w:val="24"/>
-          <w:szCs w:val="24"/>
-          <w:lang w:val="en-US"/>
-        </w:rPr>
-        <w:t>CÔNG TY TNHH GIẢI TRÍ HOÀNG HẢI</w:t>
-      </w:r>
-    </w:p>
-    <w:p>
-      <w:pPr>
-        <w:spacing w:before="120" w:after="120" w:line="276" w:lineRule="auto"/>
-        <w:ind w:left="1440" w:firstLine="720"/>
-        <w:jc w:val="both"/>
-        <w:rPr>
-          <w:b/>
-          <w:sz w:val="24"/>
-          <w:szCs w:val="24"/>
-        </w:rPr>
-      </w:pPr>
-      <w:r>
-        <w:rPr>
-          <w:b/>
-          <w:sz w:val="24"/>
-          <w:szCs w:val="24"/>
-        </w:rPr>
-        <w:t>TRUNG TÂM HỘI NGHỊ - TIỆC CƯỚI QUEEN PLAZA KỲ HOÀ</w:t>
-      </w:r>
-    </w:p>
-    <w:p>
-      <w:pPr>
-        <w:spacing w:before="120" w:after="120" w:line="276" w:lineRule="auto"/>
-        <w:ind w:left="360"/>
-        <w:jc w:val="both"/>
-        <w:rPr>
-          <w:sz w:val="24"/>
-          <w:szCs w:val="24"/>
-        </w:rPr>
-      </w:pPr>
-      <w:r>
-        <w:rPr>
-          <w:sz w:val="24"/>
-          <w:szCs w:val="24"/>
-        </w:rPr>
-        <w:t>Địa Chỉ</w:t>
-      </w:r>
-      <w:r>
-        <w:rPr>
-          <w:sz w:val="24"/>
-          <w:szCs w:val="24"/>
-        </w:rPr>
-        <w:tab/>
-      </w:r>
-      <w:r>
-        <w:rPr>
-          <w:sz w:val="24"/>
-          <w:szCs w:val="24"/>
-        </w:rPr>
-        <w:tab/>
-      </w:r>
-      <w:r>
-        <w:rPr>
-          <w:sz w:val="24"/>
-          <w:szCs w:val="24"/>
-        </w:rPr>
-        <w:t>16A Lê Hồng Phong (nối dài), Phường Hoà Hưng, TP.HCM</w:t>
-      </w:r>
-    </w:p>
-    <w:p>
-      <w:pPr>
-        <w:spacing w:before="120" w:after="120" w:line="276" w:lineRule="auto"/>
-        <w:ind w:left="360"/>
-        <w:jc w:val="both"/>
-        <w:rPr>
-          <w:sz w:val="24"/>
-          <w:szCs w:val="24"/>
-        </w:rPr>
-      </w:pPr>
-      <w:r>
-        <w:rPr>
-          <w:sz w:val="24"/>
-          <w:szCs w:val="24"/>
-        </w:rPr>
-        <w:t>Điện thoại</w:t>
-      </w:r>
-      <w:r>
-        <w:rPr>
-          <w:sz w:val="24"/>
-          <w:szCs w:val="24"/>
-        </w:rPr>
-        <w:tab/>
-      </w:r>
-      <w:r>
-        <w:rPr>
-          <w:sz w:val="24"/>
-          <w:szCs w:val="24"/>
-        </w:rPr>
-        <w:tab/>
-      </w:r>
-      <w:r>
-        <w:rPr>
-          <w:sz w:val="24"/>
-          <w:szCs w:val="24"/>
-        </w:rPr>
-        <w:t>(+8428) 38 628 899</w:t>
-      </w:r>
-    </w:p>
-    <w:p>
-      <w:pPr>
-        <w:spacing w:before="120" w:after="120" w:line="276" w:lineRule="auto"/>
-        <w:ind w:left="360"/>
-        <w:jc w:val="both"/>
-        <w:rPr>
-          <w:sz w:val="24"/>
-          <w:szCs w:val="24"/>
-          <w:lang w:val="en-US"/>
-        </w:rPr>
-      </w:pPr>
-      <w:r>
-        <w:rPr>
-          <w:b/>
-          <w:sz w:val="24"/>
-          <w:szCs w:val="24"/>
-        </w:rPr>
-        <w:t>Đại Diện:</w:t>
-      </w:r>
-      <w:r>
-        <w:rPr>
-          <w:b/>
-          <w:sz w:val="24"/>
-          <w:szCs w:val="24"/>
-        </w:rPr>
-        <w:tab/>
-      </w:r>
-      <w:r>
-        <w:rPr>
-          <w:b/>
-          <w:sz w:val="24"/>
-          <w:szCs w:val="24"/>
-        </w:rPr>
-        <w:tab/>
-      </w:r>
-      <w:r>
-        <w:rPr>
-          <w:b/>
-          <w:sz w:val="24"/>
-          <w:szCs w:val="24"/>
-        </w:rPr>
-        <w:t xml:space="preserve">Ông </w:t>
-      </w:r>
-      <w:r>
-        <w:rPr>
-          <w:b/>
-          <w:sz w:val="24"/>
-          <w:szCs w:val="24"/>
-          <w:lang w:val="en-US"/>
-        </w:rPr>
-        <w:t>LÊ VĂN PHƯỚC</w:t>
-      </w:r>
-      <w:r>
-        <w:rPr>
-          <w:b/>
-          <w:sz w:val="24"/>
-          <w:szCs w:val="24"/>
-        </w:rPr>
-        <w:tab/>
-      </w:r>
-      <w:r>
-        <w:rPr>
-          <w:b/>
-          <w:sz w:val="24"/>
-          <w:szCs w:val="24"/>
-          <w:lang w:val="en-US"/>
-        </w:rPr>
-        <w:tab/>
-      </w:r>
-      <w:r>
-        <w:rPr>
-          <w:b/>
-          <w:sz w:val="24"/>
-          <w:szCs w:val="24"/>
-          <w:lang w:val="en-US"/>
-        </w:rPr>
-        <w:t>Chức vụ: Giám Đốc</w:t>
-      </w:r>
-    </w:p>
-    <w:p>
-      <w:pPr>
-        <w:spacing w:before="120" w:after="120" w:line="276" w:lineRule="auto"/>
-        <w:ind w:left="360"/>
-        <w:jc w:val="both"/>
-        <w:rPr>
+          <w:rFonts w:hint="default"/>
+          <w:b w:val="0"/>
           <w:bCs/>
           <w:sz w:val="24"/>
           <w:szCs w:val="24"/>
@@ -1058,25 +1141,15 @@
         </w:rPr>
       </w:pPr>
       <w:r>
-        <w:t>Nhân viên Phụ Trách: {NhanVienPhuTrach}</w:t>
-      </w:r>
-    </w:p>
-    <w:p>
-      <w:pPr>
-        <w:spacing w:before="120" w:after="120"/>
-        <w:ind w:left="360" w:firstLine="720"/>
-        <w:jc w:val="both"/>
-        <w:rPr>
-          <w:sz w:val="24"/>
-          <w:szCs w:val="24"/>
-        </w:rPr>
-      </w:pPr>
-      <w:r>
-        <w:rPr>
-          <w:sz w:val="24"/>
-          <w:szCs w:val="24"/>
-        </w:rPr>
-        <w:t>&amp;</w:t>
+        <w:rPr>
+          <w:rFonts w:hint="default"/>
+          <w:b w:val="0"/>
+          <w:bCs/>
+          <w:sz w:val="24"/>
+          <w:szCs w:val="24"/>
+          <w:lang w:val="en-US"/>
+        </w:rPr>
+        <w:t>Và</w:t>
       </w:r>
     </w:p>
     <w:p>
@@ -1090,38 +1163,6 @@
           <w:szCs w:val="24"/>
         </w:rPr>
       </w:pPr>
-      <w:r>
-        <w:rPr>
-          <w:b/>
-          <w:sz w:val="24"/>
-          <w:szCs w:val="24"/>
-        </w:rPr>
-        <w:t xml:space="preserve">BÊN B:   </w:t>
-      </w:r>
-      <w:r>
-        <w:rPr>
-          <w:b/>
-          <w:sz w:val="24"/>
-          <w:szCs w:val="24"/>
-        </w:rPr>
-        <w:tab/>
-      </w:r>
-      <w:r>
-        <w:rPr>
-          <w:b/>
-          <w:sz w:val="24"/>
-          <w:szCs w:val="24"/>
-        </w:rPr>
-        <w:tab/>
-      </w:r>
-      <w:r>
-        <w:rPr>
-          <w:b/>
-          <w:sz w:val="24"/>
-          <w:szCs w:val="24"/>
-        </w:rPr>
-        <w:t xml:space="preserve">KHÁCH HÀNG </w:t>
-      </w:r>
     </w:p>
     <w:p>
       <w:pPr>
@@ -1129,13 +1170,42 @@
         <w:ind w:firstLine="360"/>
         <w:jc w:val="both"/>
         <w:rPr>
-          <w:sz w:val="24"/>
-          <w:szCs w:val="24"/>
-          <w:lang w:val="en-US"/>
-        </w:rPr>
-      </w:pPr>
-      <w:r>
-        <w:t>Tên đại diện: {BenB_TenDaiDien}</w:t>
+          <w:b/>
+          <w:sz w:val="24"/>
+          <w:szCs w:val="24"/>
+        </w:rPr>
+      </w:pPr>
+      <w:r>
+        <w:rPr>
+          <w:b/>
+          <w:sz w:val="24"/>
+          <w:szCs w:val="24"/>
+        </w:rPr>
+        <w:t xml:space="preserve">BÊN B:   </w:t>
+      </w:r>
+      <w:r>
+        <w:rPr>
+          <w:b/>
+          <w:sz w:val="24"/>
+          <w:szCs w:val="24"/>
+        </w:rPr>
+        <w:tab/>
+      </w:r>
+      <w:r>
+        <w:rPr>
+          <w:b/>
+          <w:sz w:val="24"/>
+          <w:szCs w:val="24"/>
+        </w:rPr>
+        <w:tab/>
+      </w:r>
+      <w:r>
+        <w:rPr>
+          <w:b/>
+          <w:sz w:val="24"/>
+          <w:szCs w:val="24"/>
+        </w:rPr>
+        <w:t xml:space="preserve">KHÁCH HÀNG </w:t>
       </w:r>
     </w:p>
     <w:p>
@@ -1144,14 +1214,38 @@
         <w:ind w:firstLine="360"/>
         <w:jc w:val="both"/>
         <w:rPr>
-          <w:b/>
-          <w:sz w:val="24"/>
-          <w:szCs w:val="24"/>
-          <w:lang w:val="en-US"/>
-        </w:rPr>
-      </w:pPr>
-      <w:r>
-        <w:t>Tên Chủ Tiệc: {BenB_TenChuTiec}</w:t>
+          <w:rFonts w:hint="default"/>
+          <w:b/>
+          <w:bCs/>
+          <w:sz w:val="24"/>
+          <w:szCs w:val="24"/>
+          <w:lang w:val="en-US"/>
+        </w:rPr>
+      </w:pPr>
+      <w:r>
+        <w:rPr>
+          <w:sz w:val="24"/>
+          <w:szCs w:val="24"/>
+        </w:rPr>
+        <w:t>Tên đại diện</w:t>
+      </w:r>
+      <w:r>
+        <w:rPr>
+          <w:sz w:val="24"/>
+          <w:szCs w:val="24"/>
+        </w:rPr>
+        <w:tab/>
+      </w:r>
+      <w:r>
+        <w:rPr>
+          <w:rFonts w:hint="default"/>
+          <w:b w:val="0"/>
+          <w:bCs w:val="0"/>
+          <w:sz w:val="24"/>
+          <w:szCs w:val="24"/>
+          <w:lang w:val="en-US"/>
+        </w:rPr>
+        <w:t>{BenBTenDaiDien}</w:t>
       </w:r>
     </w:p>
     <w:p>
@@ -1167,7 +1261,29 @@
         </w:rPr>
       </w:pPr>
       <w:r>
-        <w:t>CCCD: {BenB_CCCD}</w:t>
+        <w:rPr>
+          <w:sz w:val="24"/>
+          <w:szCs w:val="24"/>
+        </w:rPr>
+        <w:t>Tên Chủ Tiệc</w:t>
+      </w:r>
+      <w:r>
+        <w:rPr>
+          <w:sz w:val="24"/>
+          <w:szCs w:val="24"/>
+        </w:rPr>
+        <w:tab/>
+      </w:r>
+      <w:r>
+        <w:rPr>
+          <w:rFonts w:hint="default"/>
+          <w:b w:val="0"/>
+          <w:bCs/>
+          <w:sz w:val="24"/>
+          <w:szCs w:val="24"/>
+          <w:lang w:val="en-US"/>
+        </w:rPr>
+        <w:t>{BenBTenChuTiec}</w:t>
       </w:r>
     </w:p>
     <w:p>
@@ -1176,13 +1292,46 @@
         <w:ind w:firstLine="360"/>
         <w:jc w:val="both"/>
         <w:rPr>
-          <w:sz w:val="24"/>
-          <w:szCs w:val="24"/>
-          <w:lang w:val="en-US"/>
-        </w:rPr>
-      </w:pPr>
-      <w:r>
-        <w:t>Địa chỉ: {BenB_DiaChi}</w:t>
+          <w:b/>
+          <w:sz w:val="24"/>
+          <w:szCs w:val="24"/>
+          <w:lang w:val="en-US"/>
+        </w:rPr>
+      </w:pPr>
+      <w:r>
+        <w:rPr>
+          <w:bCs/>
+          <w:sz w:val="24"/>
+          <w:szCs w:val="24"/>
+        </w:rPr>
+        <w:t>CCCD</w:t>
+      </w:r>
+      <w:r>
+        <w:rPr>
+          <w:bCs/>
+          <w:sz w:val="24"/>
+          <w:szCs w:val="24"/>
+        </w:rPr>
+        <w:tab/>
+      </w:r>
+      <w:r>
+        <w:rPr>
+          <w:bCs/>
+          <w:sz w:val="24"/>
+          <w:szCs w:val="24"/>
+        </w:rPr>
+        <w:tab/>
+      </w:r>
+      <w:r>
+        <w:rPr>
+          <w:rFonts w:hint="default"/>
+          <w:b w:val="0"/>
+          <w:bCs/>
+          <w:sz w:val="24"/>
+          <w:szCs w:val="24"/>
+          <w:lang w:val="en-US"/>
+        </w:rPr>
+        <w:t>{BenBCCCD}</w:t>
       </w:r>
     </w:p>
     <w:p>
@@ -1191,13 +1340,83 @@
         <w:ind w:firstLine="360"/>
         <w:jc w:val="both"/>
         <w:rPr>
-          <w:sz w:val="24"/>
-          <w:szCs w:val="24"/>
-          <w:lang w:val="en-US"/>
-        </w:rPr>
-      </w:pPr>
-      <w:r>
-        <w:t>Điện thoại: {BenB_DienThoai}</w:t>
+          <w:rFonts w:hint="default"/>
+          <w:sz w:val="24"/>
+          <w:szCs w:val="24"/>
+          <w:lang w:val="en-US"/>
+        </w:rPr>
+      </w:pPr>
+      <w:r>
+        <w:rPr>
+          <w:sz w:val="24"/>
+          <w:szCs w:val="24"/>
+        </w:rPr>
+        <w:t>Địa chỉ</w:t>
+      </w:r>
+      <w:r>
+        <w:rPr>
+          <w:sz w:val="24"/>
+          <w:szCs w:val="24"/>
+        </w:rPr>
+        <w:tab/>
+      </w:r>
+      <w:r>
+        <w:rPr>
+          <w:sz w:val="24"/>
+          <w:szCs w:val="24"/>
+        </w:rPr>
+        <w:tab/>
+      </w:r>
+      <w:r>
+        <w:rPr>
+          <w:rFonts w:hint="default"/>
+          <w:sz w:val="24"/>
+          <w:szCs w:val="24"/>
+          <w:lang w:val="en-US"/>
+        </w:rPr>
+        <w:t>{BenBDiaChi}</w:t>
+      </w:r>
+    </w:p>
+    <w:p>
+      <w:pPr>
+        <w:spacing w:before="120" w:after="120" w:line="276" w:lineRule="auto"/>
+        <w:ind w:firstLine="360"/>
+        <w:jc w:val="both"/>
+        <w:rPr>
+          <w:sz w:val="24"/>
+          <w:szCs w:val="24"/>
+          <w:lang w:val="en-US"/>
+        </w:rPr>
+      </w:pPr>
+      <w:r>
+        <w:rPr>
+          <w:sz w:val="24"/>
+          <w:szCs w:val="24"/>
+        </w:rPr>
+        <w:t>Điện thoại</w:t>
+      </w:r>
+      <w:r>
+        <w:rPr>
+          <w:sz w:val="24"/>
+          <w:szCs w:val="24"/>
+        </w:rPr>
+        <w:tab/>
+      </w:r>
+      <w:r>
+        <w:rPr>
+          <w:sz w:val="24"/>
+          <w:szCs w:val="24"/>
+        </w:rPr>
+        <w:tab/>
+      </w:r>
+      <w:r>
+        <w:rPr>
+          <w:rFonts w:hint="default"/>
+          <w:sz w:val="24"/>
+          <w:szCs w:val="24"/>
+          <w:lang w:val="en-US"/>
+        </w:rPr>
+        <w:t>{BenBDienThoai}</w:t>
       </w:r>
     </w:p>
     <w:p>
@@ -1206,11 +1425,95 @@
         <w:spacing w:before="150"/>
         <w:ind w:right="348" w:firstLine="360"/>
         <w:rPr>
-          <w:lang w:val="en-US"/>
-        </w:rPr>
-      </w:pPr>
-      <w:r>
-        <w:t>phụ lục hợp đồng: {SoPhuLuc}</w:t>
+          <w:b/>
+          <w:spacing w:val="-2"/>
+          <w:lang w:val="en-US"/>
+        </w:rPr>
+      </w:pPr>
+      <w:r>
+        <w:t>Sau</w:t>
+      </w:r>
+      <w:r>
+        <w:rPr>
+          <w:spacing w:val="-3"/>
+        </w:rPr>
+        <w:t xml:space="preserve"> </w:t>
+      </w:r>
+      <w:r>
+        <w:t>khi bàn bạc, 02</w:t>
+      </w:r>
+      <w:r>
+        <w:rPr>
+          <w:spacing w:val="-1"/>
+        </w:rPr>
+        <w:t xml:space="preserve"> </w:t>
+      </w:r>
+      <w:r>
+        <w:t>bên</w:t>
+      </w:r>
+      <w:r>
+        <w:rPr>
+          <w:spacing w:val="2"/>
+        </w:rPr>
+        <w:t xml:space="preserve"> </w:t>
+      </w:r>
+      <w:r>
+        <w:t>đồng</w:t>
+      </w:r>
+      <w:r>
+        <w:rPr>
+          <w:spacing w:val="2"/>
+        </w:rPr>
+        <w:t xml:space="preserve"> </w:t>
+      </w:r>
+      <w:r>
+        <w:t>ý</w:t>
+      </w:r>
+      <w:r>
+        <w:rPr>
+          <w:spacing w:val="-5"/>
+        </w:rPr>
+        <w:t xml:space="preserve"> </w:t>
+      </w:r>
+      <w:r>
+        <w:t>ký</w:t>
+      </w:r>
+      <w:r>
+        <w:rPr>
+          <w:spacing w:val="-5"/>
+        </w:rPr>
+        <w:t xml:space="preserve"> </w:t>
+      </w:r>
+      <w:r>
+        <w:t>kết</w:t>
+      </w:r>
+      <w:r>
+        <w:rPr>
+          <w:spacing w:val="-1"/>
+        </w:rPr>
+        <w:t xml:space="preserve"> </w:t>
+      </w:r>
+      <w:r>
+        <w:t>phụ lục</w:t>
+      </w:r>
+      <w:r>
+        <w:rPr>
+          <w:spacing w:val="-1"/>
+        </w:rPr>
+        <w:t xml:space="preserve"> </w:t>
+      </w:r>
+      <w:r>
+        <w:t xml:space="preserve">hợp đồng: </w:t>
+      </w:r>
+      <w:r>
+        <w:rPr>
+          <w:rFonts w:hint="default"/>
+          <w:b w:val="0"/>
+          <w:bCs/>
+          <w:spacing w:val="-2"/>
+          <w:lang w:val="en-US"/>
+        </w:rPr>
+        <w:t>{NoiDungPhuLuc}</w:t>
       </w:r>
     </w:p>
     <w:p/>
@@ -1441,6 +1744,12 @@
       <w:r>
         <w:t xml:space="preserve">: </w:t>
       </w:r>
+      <w:r>
+        <w:rPr>
+          <w:rFonts w:hint="default"/>
+        </w:rPr>
+        <w:t>{LoaiHinhSuKien}</w:t>
+      </w:r>
     </w:p>
     <w:p>
       <w:pPr>
@@ -1452,7 +1761,142 @@
         <w:ind w:left="3361" w:right="90" w:hanging="2281"/>
       </w:pPr>
       <w:r>
-        <w:t>Vào lúc {Tiec_GioBatDau}, ngày {Tiec_Ngay} tháng {Tiec_Thang} năm {Tiec_Nam} (Dương lịch)</w:t>
+        <w:t>Ngày tiệc</w:t>
+      </w:r>
+      <w:r>
+        <w:tab/>
+      </w:r>
+      <w:r>
+        <w:t>:</w:t>
+      </w:r>
+      <w:r>
+        <w:rPr>
+          <w:spacing w:val="-2"/>
+        </w:rPr>
+        <w:t xml:space="preserve"> </w:t>
+      </w:r>
+      <w:r>
+        <w:t>Vào</w:t>
+      </w:r>
+      <w:r>
+        <w:rPr>
+          <w:spacing w:val="-2"/>
+        </w:rPr>
+        <w:t xml:space="preserve"> </w:t>
+      </w:r>
+      <w:r>
+        <w:t>lúc</w:t>
+      </w:r>
+      <w:r>
+        <w:rPr>
+          <w:spacing w:val="-3"/>
+        </w:rPr>
+        <w:t xml:space="preserve"> </w:t>
+      </w:r>
+      <w:r>
+        <w:rPr>
+          <w:rFonts w:hint="default"/>
+          <w:b w:val="0"/>
+          <w:bCs/>
+          <w:lang w:val="en-US"/>
+        </w:rPr>
+        <w:t>{TiecGioBatDau}</w:t>
+      </w:r>
+      <w:r>
+        <w:t>,</w:t>
+      </w:r>
+      <w:r>
+        <w:rPr>
+          <w:spacing w:val="-2"/>
+        </w:rPr>
+        <w:t xml:space="preserve"> </w:t>
+      </w:r>
+      <w:r>
+        <w:t>ngày</w:t>
+      </w:r>
+      <w:r>
+        <w:rPr>
+          <w:spacing w:val="-7"/>
+        </w:rPr>
+        <w:t xml:space="preserve"> </w:t>
+      </w:r>
+      <w:r>
+        <w:rPr>
+          <w:rFonts w:hint="default"/>
+          <w:b w:val="0"/>
+          <w:bCs/>
+          <w:lang w:val="en-US"/>
+        </w:rPr>
+        <w:t>{NgayToChuc}</w:t>
+      </w:r>
+      <w:r>
+        <w:rPr>
+          <w:b/>
+          <w:spacing w:val="-2"/>
+        </w:rPr>
+        <w:t xml:space="preserve"> </w:t>
+      </w:r>
+      <w:r>
+        <w:t>tháng</w:t>
+      </w:r>
+      <w:r>
+        <w:rPr>
+          <w:spacing w:val="-4"/>
+        </w:rPr>
+        <w:t xml:space="preserve"> </w:t>
+      </w:r>
+      <w:r>
+        <w:rPr>
+          <w:rFonts w:hint="default"/>
+          <w:b w:val="0"/>
+          <w:bCs/>
+          <w:lang w:val="en-US"/>
+        </w:rPr>
+        <w:t>{ThangToChuc}</w:t>
+      </w:r>
+      <w:r>
+        <w:rPr>
+          <w:b/>
+          <w:spacing w:val="-2"/>
+        </w:rPr>
+        <w:t xml:space="preserve"> </w:t>
+      </w:r>
+      <w:r>
+        <w:t>năm</w:t>
+      </w:r>
+      <w:r>
+        <w:rPr>
+          <w:spacing w:val="-2"/>
+        </w:rPr>
+        <w:t xml:space="preserve"> </w:t>
+      </w:r>
+      <w:r>
+        <w:rPr>
+          <w:rFonts w:hint="default"/>
+          <w:b w:val="0"/>
+          <w:bCs/>
+          <w:lang w:val="en-US"/>
+        </w:rPr>
+        <w:t>{NamToChuc}</w:t>
+      </w:r>
+      <w:r>
+        <w:rPr>
+          <w:b/>
+          <w:spacing w:val="-2"/>
+        </w:rPr>
+        <w:t xml:space="preserve"> </w:t>
+      </w:r>
+      <w:r>
+        <w:t>(Dương</w:t>
+      </w:r>
+      <w:r>
+        <w:rPr>
+          <w:spacing w:val="-5"/>
+        </w:rPr>
+        <w:t xml:space="preserve"> </w:t>
+      </w:r>
+      <w:r>
+        <w:t xml:space="preserve">lịch) </w:t>
       </w:r>
     </w:p>
     <w:p>
@@ -1465,7 +1909,56 @@
         <w:ind w:left="3361" w:right="90" w:hanging="2281"/>
       </w:pPr>
       <w:r>
-        <w:t>Nhằm ngày {Tiec_NgayAL} tháng {Tiec_ThangAL} năm {Tiec_NamAL} (Âm lịch)</w:t>
+        <w:rPr>
+          <w:lang w:val="en-US"/>
+        </w:rPr>
+        <w:t xml:space="preserve">                                      </w:t>
+      </w:r>
+      <w:r>
+        <w:t xml:space="preserve">Nhằm ngày </w:t>
+      </w:r>
+      <w:r>
+        <w:rPr>
+          <w:rFonts w:hint="default"/>
+          <w:b w:val="0"/>
+          <w:bCs w:val="0"/>
+          <w:lang w:val="en-US"/>
+        </w:rPr>
+        <w:t>{NgayToChucAmLich}</w:t>
+      </w:r>
+      <w:r>
+        <w:t xml:space="preserve"> tháng </w:t>
+      </w:r>
+      <w:r>
+        <w:rPr>
+          <w:rFonts w:hint="default"/>
+          <w:b w:val="0"/>
+          <w:bCs w:val="0"/>
+          <w:lang w:val="en-US"/>
+        </w:rPr>
+        <w:t>{ThangToChucAmLich}</w:t>
+      </w:r>
+      <w:r>
+        <w:t xml:space="preserve"> năm </w:t>
+      </w:r>
+      <w:r>
+        <w:rPr>
+          <w:rFonts w:hint="default"/>
+          <w:b w:val="0"/>
+          <w:bCs w:val="0"/>
+          <w:lang w:val="en-US"/>
+        </w:rPr>
+        <w:t>{NamToChucAmLich}</w:t>
+      </w:r>
+      <w:r>
+        <w:rPr>
+          <w:b/>
+          <w:bCs/>
+        </w:rPr>
+        <w:t xml:space="preserve"> </w:t>
+      </w:r>
+      <w:r>
+        <w:t>(Âm lịch)</w:t>
       </w:r>
     </w:p>
     <w:p>
@@ -1482,7 +1975,53 @@
         </w:rPr>
       </w:pPr>
       <w:r>
-        <w:t>Sảnh tiệc: {Tiec_SanhTiec}</w:t>
+        <w:rPr>
+          <w:sz w:val="24"/>
+        </w:rPr>
+        <w:t>Sảnh</w:t>
+      </w:r>
+      <w:r>
+        <w:rPr>
+          <w:spacing w:val="-3"/>
+          <w:sz w:val="24"/>
+        </w:rPr>
+        <w:t xml:space="preserve"> </w:t>
+      </w:r>
+      <w:r>
+        <w:rPr>
+          <w:spacing w:val="-4"/>
+          <w:sz w:val="24"/>
+        </w:rPr>
+        <w:t>tiệc</w:t>
+      </w:r>
+      <w:r>
+        <w:rPr>
+          <w:sz w:val="24"/>
+        </w:rPr>
+        <w:tab/>
+      </w:r>
+      <w:r>
+        <w:rPr>
+          <w:sz w:val="24"/>
+        </w:rPr>
+        <w:t>:</w:t>
+      </w:r>
+      <w:r>
+        <w:rPr>
+          <w:spacing w:val="-3"/>
+          <w:sz w:val="24"/>
+        </w:rPr>
+        <w:t xml:space="preserve"> </w:t>
+      </w:r>
+      <w:r>
+        <w:rPr>
+          <w:rFonts w:hint="default"/>
+          <w:b w:val="0"/>
+          <w:bCs/>
+          <w:sz w:val="24"/>
+          <w:lang w:val="en-US"/>
+        </w:rPr>
+        <w:t>{TenSanhTiec}</w:t>
       </w:r>
     </w:p>
     <w:p>
@@ -1500,7 +2039,69 @@
         </w:rPr>
       </w:pPr>
       <w:r>
-        <w:t>Quy mô sảnh: Từ {Sanh_QuyMoMin} bàn đến {Sanh_QuyMoMax} bàn</w:t>
+        <w:rPr>
+          <w:sz w:val="24"/>
+          <w:lang w:val="en-US"/>
+        </w:rPr>
+        <w:t>Quy mô sảnh</w:t>
+      </w:r>
+      <w:r>
+        <w:rPr>
+          <w:sz w:val="24"/>
+          <w:lang w:val="en-US"/>
+        </w:rPr>
+        <w:tab/>
+      </w:r>
+      <w:r>
+        <w:rPr>
+          <w:sz w:val="24"/>
+          <w:lang w:val="en-US"/>
+        </w:rPr>
+        <w:t>:</w:t>
+      </w:r>
+      <w:r>
+        <w:rPr>
+          <w:b/>
+          <w:sz w:val="24"/>
+          <w:lang w:val="en-US"/>
+        </w:rPr>
+        <w:t xml:space="preserve"> Từ </w:t>
+      </w:r>
+      <w:r>
+        <w:rPr>
+          <w:rFonts w:hint="default"/>
+          <w:b w:val="0"/>
+          <w:bCs/>
+          <w:sz w:val="24"/>
+          <w:lang w:val="en-US"/>
+        </w:rPr>
+        <w:t xml:space="preserve">{QuyMoBanTu} </w:t>
+      </w:r>
+      <w:r>
+        <w:rPr>
+          <w:b/>
+          <w:sz w:val="24"/>
+          <w:lang w:val="en-US"/>
+        </w:rPr>
+        <w:t xml:space="preserve">bàn đến </w:t>
+      </w:r>
+      <w:r>
+        <w:rPr>
+          <w:rFonts w:hint="default"/>
+          <w:b w:val="0"/>
+          <w:bCs/>
+          <w:sz w:val="24"/>
+          <w:lang w:val="en-US"/>
+        </w:rPr>
+        <w:t xml:space="preserve">{QuyMoBanDen} </w:t>
+      </w:r>
+      <w:r>
+        <w:rPr>
+          <w:b/>
+          <w:sz w:val="24"/>
+          <w:lang w:val="en-US"/>
+        </w:rPr>
+        <w:t xml:space="preserve">bàn </w:t>
       </w:r>
     </w:p>
     <w:p>
@@ -1517,7 +2118,38 @@
         </w:rPr>
       </w:pPr>
       <w:r>
-        <w:t>Số bàn chính thức: {SoBanChinhThuc} bàn</w:t>
+        <w:t>Số bàn chính thức</w:t>
+      </w:r>
+      <w:r>
+        <w:tab/>
+      </w:r>
+      <w:r>
+        <w:rPr>
+          <w:spacing w:val="-4"/>
+        </w:rPr>
+        <w:t>:</w:t>
+      </w:r>
+      <w:r>
+        <w:rPr>
+          <w:spacing w:val="-4"/>
+          <w:lang w:val="en-US"/>
+        </w:rPr>
+        <w:t xml:space="preserve"> </w:t>
+      </w:r>
+      <w:r>
+        <w:rPr>
+          <w:rFonts w:hint="default"/>
+          <w:spacing w:val="-4"/>
+          <w:lang w:val="en-US"/>
+        </w:rPr>
+        <w:t xml:space="preserve">{SoBanManChinhThuc </w:t>
+      </w:r>
+      <w:r>
+        <w:rPr>
+          <w:spacing w:val="-4"/>
+          <w:lang w:val="en-US"/>
+        </w:rPr>
+        <w:t xml:space="preserve">bàn </w:t>
       </w:r>
     </w:p>
     <w:p>
@@ -1534,7 +2166,40 @@
         </w:rPr>
       </w:pPr>
       <w:r>
-        <w:t>Số bàn tặng: {SoBanTang} bàn</w:t>
+        <w:rPr>
+          <w:spacing w:val="-4"/>
+          <w:lang w:val="en-US"/>
+        </w:rPr>
+        <w:t>Số bàn tặng</w:t>
+      </w:r>
+      <w:r>
+        <w:rPr>
+          <w:spacing w:val="-4"/>
+          <w:lang w:val="en-US"/>
+        </w:rPr>
+        <w:tab/>
+      </w:r>
+      <w:r>
+        <w:rPr>
+          <w:spacing w:val="-4"/>
+          <w:lang w:val="en-US"/>
+        </w:rPr>
+        <w:t xml:space="preserve">: </w:t>
+      </w:r>
+      <w:r>
+        <w:rPr>
+          <w:rFonts w:hint="default"/>
+          <w:spacing w:val="-4"/>
+          <w:lang w:val="en-US"/>
+        </w:rPr>
+        <w:t>{BanTang}</w:t>
+      </w:r>
+      <w:r>
+        <w:rPr>
+          <w:spacing w:val="-4"/>
+          <w:lang w:val="en-US"/>
+        </w:rPr>
+        <w:t xml:space="preserve"> bàn</w:t>
       </w:r>
     </w:p>
     <w:p>
@@ -1551,7 +2216,59 @@
         </w:rPr>
       </w:pPr>
       <w:r>
-        <w:t>Số bàn dự phòng: {SoBanDuPhong} bàn</w:t>
+        <w:t>Số</w:t>
+      </w:r>
+      <w:r>
+        <w:rPr>
+          <w:spacing w:val="-1"/>
+        </w:rPr>
+        <w:t xml:space="preserve"> </w:t>
+      </w:r>
+      <w:r>
+        <w:t>bàn dự</w:t>
+      </w:r>
+      <w:r>
+        <w:rPr>
+          <w:spacing w:val="-1"/>
+        </w:rPr>
+        <w:t xml:space="preserve"> </w:t>
+      </w:r>
+      <w:r>
+        <w:rPr>
+          <w:spacing w:val="-2"/>
+        </w:rPr>
+        <w:t>phòng</w:t>
+      </w:r>
+      <w:r>
+        <w:tab/>
+      </w:r>
+      <w:r>
+        <w:rPr>
+          <w:spacing w:val="-5"/>
+        </w:rPr>
+        <w:t>:</w:t>
+      </w:r>
+      <w:r>
+        <w:rPr>
+          <w:spacing w:val="-5"/>
+          <w:lang w:val="en-US"/>
+        </w:rPr>
+        <w:t xml:space="preserve"> </w:t>
+      </w:r>
+      <w:r>
+        <w:rPr>
+          <w:rFonts w:hint="default"/>
+          <w:spacing w:val="-5"/>
+          <w:lang w:val="en-US"/>
+        </w:rPr>
+        <w:t>{SoBanManDuPhong}</w:t>
+      </w:r>
+      <w:r>
+        <w:rPr>
+          <w:spacing w:val="-5"/>
+          <w:lang w:val="en-US"/>
+        </w:rPr>
+        <w:t>bàn</w:t>
       </w:r>
     </w:p>
     <w:p>
@@ -1630,7 +2347,7 @@
     </w:p>
     <w:p>
       <w:pPr>
-        <w:pStyle w:val="12"/>
+        <w:pStyle w:val="13"/>
         <w:numPr>
           <w:ilvl w:val="1"/>
           <w:numId w:val="2"/>
@@ -1688,7 +2405,7 @@
     </w:p>
     <w:p>
       <w:pPr>
-        <w:pStyle w:val="12"/>
+        <w:pStyle w:val="13"/>
         <w:numPr>
           <w:ilvl w:val="0"/>
           <w:numId w:val="3"/>
@@ -1703,12 +2420,34 @@
         </w:rPr>
       </w:pPr>
       <w:r>
-        <w:t>Số tiền: {ThanhToan_Dot2} VNĐ</w:t>
-      </w:r>
-    </w:p>
-    <w:p>
-      <w:pPr>
-        <w:pStyle w:val="12"/>
+        <w:rPr>
+          <w:bCs/>
+          <w:sz w:val="24"/>
+          <w:lang w:val="en-US"/>
+        </w:rPr>
+        <w:t xml:space="preserve">Số tiền: </w:t>
+      </w:r>
+      <w:r>
+        <w:rPr>
+          <w:rFonts w:hint="default"/>
+          <w:bCs/>
+          <w:sz w:val="24"/>
+          <w:lang w:val="en-US"/>
+        </w:rPr>
+        <w:t>{ThanhToanDot2SoTien}</w:t>
+      </w:r>
+      <w:r>
+        <w:rPr>
+          <w:bCs/>
+          <w:sz w:val="24"/>
+          <w:lang w:val="en-US"/>
+        </w:rPr>
+        <w:t xml:space="preserve"> VNĐ </w:t>
+      </w:r>
+    </w:p>
+    <w:p>
+      <w:pPr>
+        <w:pStyle w:val="13"/>
         <w:numPr>
           <w:ilvl w:val="0"/>
           <w:numId w:val="3"/>
@@ -1723,12 +2462,26 @@
         </w:rPr>
       </w:pPr>
       <w:r>
-        <w:t>Hình thức thanh toán: {HinhThucThanhToan}</w:t>
-      </w:r>
-    </w:p>
-    <w:p>
-      <w:pPr>
-        <w:pStyle w:val="12"/>
+        <w:rPr>
+          <w:bCs/>
+          <w:sz w:val="24"/>
+          <w:lang w:val="en-US"/>
+        </w:rPr>
+        <w:t xml:space="preserve">Hình thức thanh toán: </w:t>
+      </w:r>
+      <w:r>
+        <w:rPr>
+          <w:rFonts w:hint="default"/>
+          <w:bCs/>
+          <w:sz w:val="24"/>
+          <w:lang w:val="en-US"/>
+        </w:rPr>
+        <w:t>{HinhThucThanhToanDot2}</w:t>
+      </w:r>
+    </w:p>
+    <w:p>
+      <w:pPr>
+        <w:pStyle w:val="13"/>
         <w:numPr>
           <w:ilvl w:val="0"/>
           <w:numId w:val="3"/>
@@ -1743,7 +2496,21 @@
         </w:rPr>
       </w:pPr>
       <w:r>
-        <w:t>Thời gian thanh toán ngày: {HanThanhToan_Dot2}</w:t>
+        <w:rPr>
+          <w:bCs/>
+          <w:sz w:val="24"/>
+          <w:lang w:val="en-US"/>
+        </w:rPr>
+        <w:t xml:space="preserve">Thời gian thanh toán ngày:  </w:t>
+      </w:r>
+      <w:r>
+        <w:rPr>
+          <w:rFonts w:hint="default"/>
+          <w:bCs/>
+          <w:sz w:val="24"/>
+          <w:lang w:val="en-US"/>
+        </w:rPr>
+        <w:t>{HanThanhToanDot2}</w:t>
       </w:r>
     </w:p>
     <w:p>
@@ -1770,7 +2537,7 @@
     </w:p>
     <w:p>
       <w:pPr>
-        <w:pStyle w:val="12"/>
+        <w:pStyle w:val="13"/>
         <w:numPr>
           <w:ilvl w:val="1"/>
           <w:numId w:val="2"/>
@@ -1841,27 +2608,35 @@
     </w:p>
     <w:p>
       <w:pPr>
-        <w:pStyle w:val="12"/>
+        <w:pStyle w:val="13"/>
         <w:numPr>
           <w:ilvl w:val="0"/>
           <w:numId w:val="4"/>
         </w:numPr>
         <w:tabs>
           <w:tab w:val="left" w:pos="600"/>
+          <w:tab w:val="clear" w:pos="420"/>
         </w:tabs>
-        <w:spacing w:before="0" w:line="360" w:lineRule="auto"/>
-        <w:rPr>
+        <w:spacing w:line="360" w:lineRule="auto"/>
+        <w:ind w:left="420" w:leftChars="0" w:hanging="420" w:firstLineChars="0"/>
+        <w:rPr>
+          <w:b/>
+          <w:sz w:val="24"/>
+        </w:rPr>
+      </w:pPr>
+      <w:r>
+        <w:rPr>
+          <w:rFonts w:hint="default"/>
+          <w:b w:val="0"/>
           <w:bCs/>
           <w:sz w:val="24"/>
         </w:rPr>
-      </w:pPr>
-      <w:r>
-        <w:t>{#DichVuTinhPhi}- {TenDichVu} (SL: {SoLuong}): {DonGia} ({GhiChu}){/DichVuTinhPhi}</w:t>
-      </w:r>
-    </w:p>
-    <w:p>
-      <w:pPr>
-        <w:pStyle w:val="12"/>
+        <w:t>{@DichVuTinhPhiPhuLuc}</w:t>
+      </w:r>
+    </w:p>
+    <w:p>
+      <w:pPr>
+        <w:pStyle w:val="13"/>
         <w:numPr>
           <w:ilvl w:val="1"/>
           <w:numId w:val="2"/>
@@ -1886,50 +2661,36 @@
     </w:p>
     <w:p>
       <w:pPr>
-        <w:pStyle w:val="12"/>
+        <w:pStyle w:val="13"/>
         <w:numPr>
           <w:ilvl w:val="0"/>
           <w:numId w:val="5"/>
         </w:numPr>
         <w:tabs>
-          <w:tab w:val="left" w:pos="498"/>
-        </w:tabs>
-        <w:spacing w:before="0" w:line="360" w:lineRule="auto"/>
-        <w:rPr>
-          <w:sz w:val="24"/>
-        </w:rPr>
-      </w:pPr>
-      <w:r>
-        <w:t>{ThoaThuanChung}</w:t>
-      </w:r>
-    </w:p>
-    <w:p>
-      <w:r>
-        <w:t>{ChuongTrinhBia}</w:t>
-      </w:r>
-    </w:p>
-    <w:p>
-      <w:r>
-        <w:t>{ChuongTrinhLe}</w:t>
-      </w:r>
-    </w:p>
-    <w:p>
-      <w:pPr>
-        <w:pStyle w:val="12"/>
-        <w:tabs>
           <w:tab w:val="left" w:pos="600"/>
+          <w:tab w:val="clear" w:pos="420"/>
         </w:tabs>
         <w:spacing w:line="360" w:lineRule="auto"/>
-        <w:ind w:left="360" w:firstLine="0"/>
-        <w:rPr>
-          <w:b/>
-          <w:sz w:val="24"/>
-        </w:rPr>
-      </w:pPr>
-    </w:p>
-    <w:p>
-      <w:pPr>
-        <w:pStyle w:val="12"/>
+        <w:ind w:left="420" w:leftChars="0" w:hanging="420" w:firstLineChars="0"/>
+        <w:rPr>
+          <w:b w:val="0"/>
+          <w:bCs/>
+          <w:sz w:val="24"/>
+        </w:rPr>
+      </w:pPr>
+      <w:r>
+        <w:rPr>
+          <w:rFonts w:hint="default"/>
+          <w:b w:val="0"/>
+          <w:bCs/>
+          <w:sz w:val="24"/>
+        </w:rPr>
+        <w:t>{@ThoaThuanPhuLucKhac}</w:t>
+      </w:r>
+    </w:p>
+    <w:p>
+      <w:pPr>
+        <w:pStyle w:val="13"/>
         <w:numPr>
           <w:ilvl w:val="1"/>
           <w:numId w:val="2"/>
@@ -1984,12 +2745,9 @@
         </w:tblCellMar>
       </w:tblPr>
       <w:tblGrid>
-        <w:gridCol w:w="671"/>
-        <w:gridCol w:w="6975"/>
-        <w:gridCol w:w="1804"/>
-        <w:gridCol w:w="360"/>
-        <w:gridCol w:w="360"/>
-        <w:gridCol w:w="360"/>
+        <w:gridCol w:w="1336"/>
+        <w:gridCol w:w="6310"/>
+        <w:gridCol w:w="1980"/>
       </w:tblGrid>
       <w:tr>
         <w:tblPrEx>
@@ -2009,18 +2767,17 @@
           </w:tblCellMar>
         </w:tblPrEx>
         <w:trPr>
-          <w:gridAfter w:val="3"/>
           <w:trHeight w:val="318" w:hRule="atLeast"/>
         </w:trPr>
         <w:tc>
           <w:tcPr>
-            <w:tcW w:w="671" w:type="dxa"/>
+            <w:tcW w:w="1336" w:type="dxa"/>
             <w:vMerge w:val="restart"/>
             <w:shd w:val="clear" w:color="auto" w:fill="E6E6E6"/>
           </w:tcPr>
           <w:p>
             <w:pPr>
-              <w:pStyle w:val="13"/>
+              <w:pStyle w:val="14"/>
               <w:spacing w:before="181"/>
               <w:ind w:left="107"/>
               <w:rPr>
@@ -2040,13 +2797,13 @@
         </w:tc>
         <w:tc>
           <w:tcPr>
-            <w:tcW w:w="6975" w:type="dxa"/>
+            <w:tcW w:w="6310" w:type="dxa"/>
             <w:vMerge w:val="restart"/>
             <w:shd w:val="clear" w:color="auto" w:fill="E6E6E6"/>
           </w:tcPr>
           <w:p>
             <w:pPr>
-              <w:pStyle w:val="13"/>
+              <w:pStyle w:val="14"/>
               <w:spacing w:before="181"/>
               <w:ind w:left="9"/>
               <w:jc w:val="center"/>
@@ -2085,18 +2842,56 @@
                 <w:sz w:val="24"/>
                 <w:lang w:val="en-US"/>
               </w:rPr>
-              <w:t xml:space="preserve"> bàn tiệc 5.750.000VNĐ/bàn/10 khách</w:t>
+              <w:t xml:space="preserve"> bàn tiệc </w:t>
+            </w:r>
+            <w:r>
+              <w:rPr>
+                <w:rFonts w:hint="default"/>
+                <w:b/>
+                <w:spacing w:val="-5"/>
+                <w:sz w:val="24"/>
+                <w:lang w:val="en-US"/>
+              </w:rPr>
+              <w:t>{DonGiaBanTiec}</w:t>
+            </w:r>
+            <w:r>
+              <w:rPr>
+                <w:b/>
+                <w:spacing w:val="-5"/>
+                <w:sz w:val="24"/>
+                <w:lang w:val="en-US"/>
+              </w:rPr>
+              <w:t>VNĐ/bàn/</w:t>
+            </w:r>
+            <w:r>
+              <w:rPr>
+                <w:rFonts w:hint="default"/>
+                <w:b/>
+                <w:spacing w:val="-5"/>
+                <w:sz w:val="24"/>
+                <w:lang w:val="en-US"/>
+              </w:rPr>
+              <w:t>{SoKhachTrenBan}</w:t>
+            </w:r>
+            <w:r>
+              <w:rPr>
+                <w:b/>
+                <w:spacing w:val="-5"/>
+                <w:sz w:val="24"/>
+                <w:lang w:val="en-US"/>
+              </w:rPr>
+              <w:t xml:space="preserve"> khách</w:t>
             </w:r>
           </w:p>
         </w:tc>
         <w:tc>
           <w:tcPr>
-            <w:tcW w:w="1804" w:type="dxa"/>
+            <w:tcW w:w="1980" w:type="dxa"/>
             <w:shd w:val="clear" w:color="auto" w:fill="E6E6E6"/>
           </w:tcPr>
           <w:p>
             <w:pPr>
-              <w:pStyle w:val="13"/>
+              <w:pStyle w:val="14"/>
               <w:spacing w:before="18"/>
               <w:ind w:left="7" w:right="4"/>
               <w:jc w:val="center"/>
@@ -2132,67 +2927,282 @@
         </w:tc>
       </w:tr>
       <w:tr>
+        <w:tblPrEx>
+          <w:tblBorders>
+            <w:top w:val="single" w:color="000000" w:sz="4" w:space="0"/>
+            <w:left w:val="single" w:color="000000" w:sz="4" w:space="0"/>
+            <w:bottom w:val="single" w:color="000000" w:sz="4" w:space="0"/>
+            <w:right w:val="single" w:color="000000" w:sz="4" w:space="0"/>
+            <w:insideH w:val="single" w:color="000000" w:sz="4" w:space="0"/>
+            <w:insideV w:val="single" w:color="000000" w:sz="4" w:space="0"/>
+          </w:tblBorders>
+          <w:tblCellMar>
+            <w:top w:w="0" w:type="dxa"/>
+            <w:left w:w="0" w:type="dxa"/>
+            <w:bottom w:w="0" w:type="dxa"/>
+            <w:right w:w="0" w:type="dxa"/>
+          </w:tblCellMar>
+        </w:tblPrEx>
+        <w:trPr>
+          <w:trHeight w:val="316" w:hRule="atLeast"/>
+        </w:trPr>
         <w:tc>
           <w:tcPr>
-            <w:gridSpan w:val="3"/>
+            <w:tcW w:w="1336" w:type="dxa"/>
+            <w:vMerge w:val="continue"/>
+            <w:tcBorders>
+              <w:top w:val="nil"/>
+            </w:tcBorders>
+            <w:shd w:val="clear" w:color="auto" w:fill="E6E6E6"/>
           </w:tcPr>
           <w:p>
+            <w:pPr>
+              <w:rPr>
+                <w:sz w:val="2"/>
+                <w:szCs w:val="2"/>
+              </w:rPr>
+            </w:pPr>
+          </w:p>
+        </w:tc>
+        <w:tc>
+          <w:tcPr>
+            <w:tcW w:w="6310" w:type="dxa"/>
+            <w:vMerge w:val="continue"/>
+            <w:tcBorders>
+              <w:top w:val="nil"/>
+            </w:tcBorders>
+            <w:shd w:val="clear" w:color="auto" w:fill="E6E6E6"/>
+          </w:tcPr>
+          <w:p>
+            <w:pPr>
+              <w:rPr>
+                <w:sz w:val="2"/>
+                <w:szCs w:val="2"/>
+              </w:rPr>
+            </w:pPr>
+          </w:p>
+        </w:tc>
+        <w:tc>
+          <w:tcPr>
+            <w:tcW w:w="1980" w:type="dxa"/>
+            <w:shd w:val="clear" w:color="auto" w:fill="E6E6E6"/>
+          </w:tcPr>
+          <w:p>
+            <w:pPr>
+              <w:pStyle w:val="14"/>
+              <w:spacing w:before="18"/>
+              <w:ind w:left="7"/>
+              <w:jc w:val="center"/>
+              <w:rPr>
+                <w:b/>
+                <w:sz w:val="24"/>
+                <w:lang w:val="en-US"/>
+              </w:rPr>
+            </w:pPr>
             <w:r>
-              <w:t>{#MenuTiec}</w:t>
+              <w:rPr>
+                <w:b/>
+                <w:spacing w:val="-5"/>
+                <w:sz w:val="24"/>
+                <w:lang w:val="en-US"/>
+              </w:rPr>
+              <w:t>VNĐ</w:t>
             </w:r>
           </w:p>
         </w:tc>
       </w:tr>
       <w:tr>
+        <w:tblPrEx>
+          <w:tblBorders>
+            <w:top w:val="single" w:color="000000" w:sz="4" w:space="0"/>
+            <w:left w:val="single" w:color="000000" w:sz="4" w:space="0"/>
+            <w:bottom w:val="single" w:color="000000" w:sz="4" w:space="0"/>
+            <w:right w:val="single" w:color="000000" w:sz="4" w:space="0"/>
+            <w:insideH w:val="single" w:color="000000" w:sz="4" w:space="0"/>
+            <w:insideV w:val="single" w:color="000000" w:sz="4" w:space="0"/>
+          </w:tblBorders>
+          <w:tblCellMar>
+            <w:top w:w="0" w:type="dxa"/>
+            <w:left w:w="0" w:type="dxa"/>
+            <w:bottom w:w="0" w:type="dxa"/>
+            <w:right w:w="0" w:type="dxa"/>
+          </w:tblCellMar>
+        </w:tblPrEx>
+        <w:trPr>
+          <w:trHeight w:val="395" w:hRule="atLeast"/>
+        </w:trPr>
         <w:tc>
+          <w:tcPr>
+            <w:tcW w:w="1336" w:type="dxa"/>
+          </w:tcPr>
           <w:p>
+            <w:pPr>
+              <w:pStyle w:val="14"/>
+              <w:spacing w:before="83"/>
+              <w:ind w:left="9"/>
+              <w:jc w:val="center"/>
+              <w:rPr>
+                <w:spacing w:val="-10"/>
+                <w:sz w:val="24"/>
+              </w:rPr>
+            </w:pPr>
             <w:r>
-              <w:t>{STT}</w:t>
+              <w:rPr>
+                <w:rFonts w:hint="default"/>
+                <w:spacing w:val="-10"/>
+                <w:sz w:val="24"/>
+              </w:rPr>
+              <w:t>{#MenuTiec}</w:t>
             </w:r>
           </w:p>
         </w:tc>
         <w:tc>
+          <w:tcPr>
+            <w:tcW w:w="6310" w:type="dxa"/>
+          </w:tcPr>
           <w:p>
+            <w:pPr>
+              <w:pStyle w:val="14"/>
+              <w:ind w:firstLine="107"/>
+              <w:rPr>
+                <w:sz w:val="24"/>
+                <w:lang w:val="en-US"/>
+              </w:rPr>
+            </w:pPr>
             <w:r>
+              <w:rPr>
+                <w:rFonts w:hint="default"/>
+              </w:rPr>
               <w:t>{TenMonAn}</w:t>
             </w:r>
           </w:p>
         </w:tc>
         <w:tc>
+          <w:tcPr>
+            <w:tcW w:w="1980" w:type="dxa"/>
+          </w:tcPr>
           <w:p>
+            <w:pPr>
+              <w:pStyle w:val="14"/>
+              <w:jc w:val="center"/>
+              <w:rPr>
+                <w:b/>
+                <w:bCs/>
+                <w:sz w:val="24"/>
+                <w:lang w:val="en-US"/>
+              </w:rPr>
+            </w:pPr>
             <w:r>
+              <w:rPr>
+                <w:rFonts w:hint="default"/>
+                <w:b/>
+                <w:bCs/>
+                <w:sz w:val="24"/>
+                <w:lang w:val="en-US"/>
+              </w:rPr>
               <w:t>{DonGia}</w:t>
             </w:r>
           </w:p>
         </w:tc>
       </w:tr>
       <w:tr>
+        <w:tblPrEx>
+          <w:tblBorders>
+            <w:top w:val="single" w:color="000000" w:sz="4" w:space="0"/>
+            <w:left w:val="single" w:color="000000" w:sz="4" w:space="0"/>
+            <w:bottom w:val="single" w:color="000000" w:sz="4" w:space="0"/>
+            <w:right w:val="single" w:color="000000" w:sz="4" w:space="0"/>
+            <w:insideH w:val="single" w:color="000000" w:sz="4" w:space="0"/>
+            <w:insideV w:val="single" w:color="000000" w:sz="4" w:space="0"/>
+          </w:tblBorders>
+          <w:tblCellMar>
+            <w:top w:w="0" w:type="dxa"/>
+            <w:left w:w="0" w:type="dxa"/>
+            <w:bottom w:w="0" w:type="dxa"/>
+            <w:right w:w="0" w:type="dxa"/>
+          </w:tblCellMar>
+        </w:tblPrEx>
+        <w:trPr>
+          <w:trHeight w:val="421" w:hRule="atLeast"/>
+        </w:trPr>
         <w:tc>
           <w:tcPr>
-            <w:gridSpan w:val="3"/>
+            <w:tcW w:w="1336" w:type="dxa"/>
           </w:tcPr>
           <w:p>
-            <w:r>
-              <w:t>{/MenuTiec}</w:t>
-            </w:r>
+            <w:pPr>
+              <w:pStyle w:val="14"/>
+              <w:rPr>
+                <w:sz w:val="24"/>
+              </w:rPr>
+            </w:pPr>
           </w:p>
         </w:tc>
-      </w:tr>
-      <w:tr>
         <w:tc>
           <w:tcPr>
-            <w:gridSpan w:val="2"/>
+            <w:tcW w:w="6310" w:type="dxa"/>
           </w:tcPr>
           <w:p>
+            <w:pPr>
+              <w:pStyle w:val="14"/>
+              <w:spacing w:before="71"/>
+              <w:ind w:left="9"/>
+              <w:jc w:val="center"/>
+              <w:rPr>
+                <w:b/>
+                <w:sz w:val="24"/>
+              </w:rPr>
+            </w:pPr>
             <w:r>
-              <w:t>TỔNG CỘNG</w:t>
+              <w:rPr>
+                <w:b/>
+                <w:sz w:val="24"/>
+              </w:rPr>
+              <w:t>TỔNG</w:t>
+            </w:r>
+            <w:r>
+              <w:rPr>
+                <w:b/>
+                <w:spacing w:val="-2"/>
+                <w:sz w:val="24"/>
+              </w:rPr>
+              <w:t xml:space="preserve"> </w:t>
+            </w:r>
+            <w:r>
+              <w:rPr>
+                <w:b/>
+                <w:spacing w:val="-4"/>
+                <w:sz w:val="24"/>
+              </w:rPr>
+              <w:t>CỘNG</w:t>
             </w:r>
           </w:p>
         </w:tc>
         <w:tc>
+          <w:tcPr>
+            <w:tcW w:w="1980" w:type="dxa"/>
+            <w:vAlign w:val="center"/>
+          </w:tcPr>
           <w:p>
+            <w:pPr>
+              <w:pStyle w:val="14"/>
+              <w:jc w:val="right"/>
+              <w:rPr>
+                <w:b/>
+                <w:bCs/>
+                <w:sz w:val="24"/>
+                <w:lang w:val="en-US"/>
+              </w:rPr>
+            </w:pPr>
             <w:r>
-              <w:t>{Menu_TongCong}</w:t>
+              <w:rPr>
+                <w:rFonts w:hint="default"/>
+                <w:b/>
+                <w:bCs/>
+                <w:sz w:val="24"/>
+                <w:lang w:val="en-US"/>
+              </w:rPr>
+              <w:t>{MenuTongCong}</w:t>
             </w:r>
           </w:p>
         </w:tc>
@@ -2200,7 +3210,7 @@
     </w:tbl>
     <w:p>
       <w:pPr>
-        <w:pStyle w:val="12"/>
+        <w:pStyle w:val="13"/>
         <w:tabs>
           <w:tab w:val="left" w:pos="360"/>
         </w:tabs>
@@ -2215,7 +3225,7 @@
     </w:p>
     <w:p>
       <w:pPr>
-        <w:pStyle w:val="12"/>
+        <w:pStyle w:val="13"/>
         <w:numPr>
           <w:ilvl w:val="1"/>
           <w:numId w:val="2"/>
@@ -2231,172 +3241,710 @@
         </w:rPr>
       </w:pPr>
       <w:r>
-        <w:t>Giá trị Hợp Đồng tạm tính: {GiaTriHopDongTamTinh} VNĐ</w:t>
+        <w:rPr>
+          <w:b/>
+          <w:sz w:val="24"/>
+        </w:rPr>
+        <w:t>Giá</w:t>
+      </w:r>
+      <w:r>
+        <w:rPr>
+          <w:b/>
+          <w:spacing w:val="-1"/>
+          <w:sz w:val="24"/>
+        </w:rPr>
+        <w:t xml:space="preserve"> </w:t>
+      </w:r>
+      <w:r>
+        <w:rPr>
+          <w:b/>
+          <w:sz w:val="24"/>
+        </w:rPr>
+        <w:t>trị</w:t>
+      </w:r>
+      <w:r>
+        <w:rPr>
+          <w:b/>
+          <w:spacing w:val="-1"/>
+          <w:sz w:val="24"/>
+        </w:rPr>
+        <w:t xml:space="preserve">  </w:t>
+      </w:r>
+      <w:r>
+        <w:rPr>
+          <w:b/>
+          <w:sz w:val="24"/>
+        </w:rPr>
+        <w:t>Hợp</w:t>
+      </w:r>
+      <w:r>
+        <w:rPr>
+          <w:b/>
+          <w:spacing w:val="-1"/>
+          <w:sz w:val="24"/>
+        </w:rPr>
+        <w:t xml:space="preserve"> </w:t>
+      </w:r>
+      <w:r>
+        <w:rPr>
+          <w:b/>
+          <w:sz w:val="24"/>
+        </w:rPr>
+        <w:t>Đồng</w:t>
+      </w:r>
+      <w:r>
+        <w:rPr>
+          <w:b/>
+          <w:sz w:val="24"/>
+          <w:lang w:val="en-US"/>
+        </w:rPr>
+        <w:t xml:space="preserve"> tạm tính</w:t>
+      </w:r>
+      <w:r>
+        <w:rPr>
+          <w:b/>
+          <w:spacing w:val="-1"/>
+          <w:sz w:val="24"/>
+          <w:lang w:val="en-US"/>
+        </w:rPr>
+        <w:t>:</w:t>
       </w:r>
     </w:p>
     <w:tbl>
       <w:tblPr>
+        <w:tblStyle w:val="4"/>
+        <w:tblW w:w="0" w:type="auto"/>
+        <w:tblInd w:w="78" w:type="dxa"/>
         <w:tblBorders>
-          <w:top w:val="single" w:sz="4" w:space="0" w:color="000000"/>
-          <w:left w:val="single" w:sz="4" w:space="0" w:color="000000"/>
-          <w:bottom w:val="single" w:sz="4" w:space="0" w:color="000000"/>
-          <w:right w:val="single" w:sz="4" w:space="0" w:color="000000"/>
-          <w:insideH w:val="single" w:sz="4" w:space="0" w:color="000000"/>
-          <w:insideV w:val="single" w:sz="4" w:space="0" w:color="000000"/>
+          <w:top w:val="none" w:color="auto" w:sz="0" w:space="0"/>
+          <w:left w:val="none" w:color="auto" w:sz="0" w:space="0"/>
+          <w:bottom w:val="none" w:color="auto" w:sz="0" w:space="0"/>
+          <w:right w:val="none" w:color="auto" w:sz="0" w:space="0"/>
+          <w:insideH w:val="none" w:color="auto" w:sz="0" w:space="0"/>
+          <w:insideV w:val="none" w:color="auto" w:sz="0" w:space="0"/>
         </w:tblBorders>
-        <w:tblW w:w="5000" w:type="pct"/>
+        <w:tblLayout w:type="fixed"/>
+        <w:tblCellMar>
+          <w:top w:w="0" w:type="dxa"/>
+          <w:left w:w="108" w:type="dxa"/>
+          <w:bottom w:w="0" w:type="dxa"/>
+          <w:right w:w="108" w:type="dxa"/>
+        </w:tblCellMar>
       </w:tblPr>
+      <w:tblGrid>
+        <w:gridCol w:w="731"/>
+        <w:gridCol w:w="2809"/>
+        <w:gridCol w:w="1485"/>
+        <w:gridCol w:w="1515"/>
+        <w:gridCol w:w="1380"/>
+        <w:gridCol w:w="1785"/>
+      </w:tblGrid>
       <w:tr>
+        <w:tblPrEx>
+          <w:tblBorders>
+            <w:top w:val="none" w:color="auto" w:sz="0" w:space="0"/>
+            <w:left w:val="none" w:color="auto" w:sz="0" w:space="0"/>
+            <w:bottom w:val="none" w:color="auto" w:sz="0" w:space="0"/>
+            <w:right w:val="none" w:color="auto" w:sz="0" w:space="0"/>
+            <w:insideH w:val="none" w:color="auto" w:sz="0" w:space="0"/>
+            <w:insideV w:val="none" w:color="auto" w:sz="0" w:space="0"/>
+          </w:tblBorders>
+          <w:tblCellMar>
+            <w:top w:w="0" w:type="dxa"/>
+            <w:left w:w="108" w:type="dxa"/>
+            <w:bottom w:w="0" w:type="dxa"/>
+            <w:right w:w="108" w:type="dxa"/>
+          </w:tblCellMar>
+        </w:tblPrEx>
+        <w:trPr>
+          <w:trHeight w:val="672" w:hRule="atLeast"/>
+        </w:trPr>
         <w:tc>
+          <w:tcPr>
+            <w:tcW w:w="731" w:type="dxa"/>
+            <w:tcBorders>
+              <w:top w:val="single" w:color="auto" w:sz="6" w:space="0"/>
+              <w:left w:val="single" w:color="auto" w:sz="6" w:space="0"/>
+              <w:bottom w:val="single" w:color="auto" w:sz="6" w:space="0"/>
+              <w:right w:val="single" w:color="auto" w:sz="6" w:space="0"/>
+              <w:tl2br w:val="nil"/>
+              <w:tr2bl w:val="nil"/>
+            </w:tcBorders>
+            <w:noWrap w:val="0"/>
+            <w:vAlign w:val="top"/>
+          </w:tcPr>
           <w:p>
+            <w:pPr>
+              <w:spacing w:beforeLines="0" w:afterLines="0"/>
+              <w:jc w:val="center"/>
+              <w:rPr>
+                <w:rFonts w:hint="eastAsia" w:ascii="Times New Roman" w:hAnsi="Times New Roman" w:eastAsia="Times New Roman"/>
+                <w:b/>
+                <w:color w:val="000000"/>
+                <w:sz w:val="22"/>
+                <w:szCs w:val="24"/>
+              </w:rPr>
+            </w:pPr>
+            <w:bookmarkStart w:id="0" w:name="_MON_1646391353"/>
+            <w:bookmarkEnd w:id="0"/>
             <w:r>
               <w:rPr>
+                <w:rFonts w:hint="eastAsia" w:ascii="Times New Roman" w:hAnsi="Times New Roman" w:eastAsia="Times New Roman"/>
                 <w:b/>
+                <w:color w:val="000000"/>
+                <w:sz w:val="22"/>
+                <w:szCs w:val="24"/>
               </w:rPr>
               <w:t>STT</w:t>
             </w:r>
           </w:p>
         </w:tc>
         <w:tc>
+          <w:tcPr>
+            <w:tcW w:w="2809" w:type="dxa"/>
+            <w:tcBorders>
+              <w:top w:val="single" w:color="auto" w:sz="6" w:space="0"/>
+              <w:left w:val="single" w:color="auto" w:sz="6" w:space="0"/>
+              <w:bottom w:val="single" w:color="auto" w:sz="6" w:space="0"/>
+              <w:right w:val="single" w:color="auto" w:sz="6" w:space="0"/>
+              <w:tl2br w:val="nil"/>
+              <w:tr2bl w:val="nil"/>
+            </w:tcBorders>
+            <w:noWrap w:val="0"/>
+            <w:vAlign w:val="top"/>
+          </w:tcPr>
           <w:p>
+            <w:pPr>
+              <w:spacing w:beforeLines="0" w:afterLines="0"/>
+              <w:jc w:val="center"/>
+              <w:rPr>
+                <w:rFonts w:hint="eastAsia" w:ascii="Times New Roman" w:hAnsi="Times New Roman" w:eastAsia="Times New Roman"/>
+                <w:b/>
+                <w:color w:val="000000"/>
+                <w:sz w:val="22"/>
+                <w:szCs w:val="24"/>
+              </w:rPr>
+            </w:pPr>
             <w:r>
               <w:rPr>
+                <w:rFonts w:hint="eastAsia" w:ascii="Times New Roman" w:hAnsi="Times New Roman" w:eastAsia="Times New Roman"/>
                 <w:b/>
+                <w:color w:val="000000"/>
+                <w:sz w:val="22"/>
+                <w:szCs w:val="24"/>
               </w:rPr>
               <w:t>NỘI DUNG</w:t>
             </w:r>
           </w:p>
         </w:tc>
         <w:tc>
+          <w:tcPr>
+            <w:tcW w:w="1485" w:type="dxa"/>
+            <w:tcBorders>
+              <w:top w:val="single" w:color="auto" w:sz="6" w:space="0"/>
+              <w:left w:val="single" w:color="auto" w:sz="6" w:space="0"/>
+              <w:bottom w:val="single" w:color="auto" w:sz="6" w:space="0"/>
+              <w:right w:val="single" w:color="auto" w:sz="6" w:space="0"/>
+              <w:tl2br w:val="nil"/>
+              <w:tr2bl w:val="nil"/>
+            </w:tcBorders>
+            <w:noWrap w:val="0"/>
+            <w:vAlign w:val="top"/>
+          </w:tcPr>
           <w:p>
+            <w:pPr>
+              <w:spacing w:beforeLines="0" w:afterLines="0"/>
+              <w:jc w:val="center"/>
+              <w:rPr>
+                <w:rFonts w:hint="eastAsia" w:ascii="Times New Roman" w:hAnsi="Times New Roman" w:eastAsia="Times New Roman"/>
+                <w:b/>
+                <w:color w:val="000000"/>
+                <w:sz w:val="22"/>
+                <w:szCs w:val="24"/>
+              </w:rPr>
+            </w:pPr>
             <w:r>
               <w:rPr>
+                <w:rFonts w:hint="eastAsia" w:ascii="Times New Roman" w:hAnsi="Times New Roman" w:eastAsia="Times New Roman"/>
                 <w:b/>
+                <w:color w:val="000000"/>
+                <w:sz w:val="22"/>
+                <w:szCs w:val="24"/>
               </w:rPr>
               <w:t>ĐVT</w:t>
             </w:r>
           </w:p>
         </w:tc>
         <w:tc>
+          <w:tcPr>
+            <w:tcW w:w="1515" w:type="dxa"/>
+            <w:tcBorders>
+              <w:top w:val="single" w:color="auto" w:sz="6" w:space="0"/>
+              <w:left w:val="single" w:color="auto" w:sz="6" w:space="0"/>
+              <w:bottom w:val="single" w:color="auto" w:sz="6" w:space="0"/>
+              <w:right w:val="single" w:color="auto" w:sz="6" w:space="0"/>
+              <w:tl2br w:val="nil"/>
+              <w:tr2bl w:val="nil"/>
+            </w:tcBorders>
+            <w:noWrap w:val="0"/>
+            <w:vAlign w:val="top"/>
+          </w:tcPr>
           <w:p>
+            <w:pPr>
+              <w:spacing w:beforeLines="0" w:afterLines="0"/>
+              <w:jc w:val="center"/>
+              <w:rPr>
+                <w:rFonts w:hint="eastAsia" w:ascii="Times New Roman" w:hAnsi="Times New Roman" w:eastAsia="Times New Roman"/>
+                <w:b/>
+                <w:color w:val="000000"/>
+                <w:sz w:val="22"/>
+                <w:szCs w:val="24"/>
+              </w:rPr>
+            </w:pPr>
             <w:r>
               <w:rPr>
+                <w:rFonts w:hint="eastAsia" w:ascii="Times New Roman" w:hAnsi="Times New Roman" w:eastAsia="Times New Roman"/>
                 <w:b/>
+                <w:color w:val="000000"/>
+                <w:sz w:val="22"/>
+                <w:szCs w:val="24"/>
               </w:rPr>
-              <w:t>SỐ LƯỢNG</w:t>
+              <w:t xml:space="preserve"> SỐ LƯỢNG </w:t>
             </w:r>
           </w:p>
         </w:tc>
         <w:tc>
+          <w:tcPr>
+            <w:tcW w:w="1380" w:type="dxa"/>
+            <w:tcBorders>
+              <w:top w:val="single" w:color="auto" w:sz="6" w:space="0"/>
+              <w:left w:val="single" w:color="auto" w:sz="6" w:space="0"/>
+              <w:bottom w:val="single" w:color="auto" w:sz="6" w:space="0"/>
+              <w:right w:val="single" w:color="auto" w:sz="6" w:space="0"/>
+              <w:tl2br w:val="nil"/>
+              <w:tr2bl w:val="nil"/>
+            </w:tcBorders>
+            <w:noWrap w:val="0"/>
+            <w:vAlign w:val="top"/>
+          </w:tcPr>
           <w:p>
+            <w:pPr>
+              <w:spacing w:beforeLines="0" w:afterLines="0"/>
+              <w:jc w:val="center"/>
+              <w:rPr>
+                <w:rFonts w:hint="eastAsia" w:ascii="Times New Roman" w:hAnsi="Times New Roman" w:eastAsia="Times New Roman"/>
+                <w:b/>
+                <w:color w:val="000000"/>
+                <w:sz w:val="22"/>
+                <w:szCs w:val="24"/>
+              </w:rPr>
+            </w:pPr>
             <w:r>
               <w:rPr>
+                <w:rFonts w:hint="eastAsia" w:ascii="Times New Roman" w:hAnsi="Times New Roman" w:eastAsia="Times New Roman"/>
                 <w:b/>
+                <w:color w:val="000000"/>
+                <w:sz w:val="22"/>
+                <w:szCs w:val="24"/>
               </w:rPr>
-              <w:t>ĐƠN GIÁ (VNĐ)</w:t>
+              <w:t xml:space="preserve"> ĐƠN GIÁ (VNĐ) </w:t>
             </w:r>
           </w:p>
         </w:tc>
         <w:tc>
+          <w:tcPr>
+            <w:tcW w:w="1785" w:type="dxa"/>
+            <w:tcBorders>
+              <w:top w:val="single" w:color="auto" w:sz="6" w:space="0"/>
+              <w:left w:val="single" w:color="auto" w:sz="6" w:space="0"/>
+              <w:bottom w:val="single" w:color="auto" w:sz="6" w:space="0"/>
+              <w:right w:val="single" w:color="auto" w:sz="6" w:space="0"/>
+              <w:tl2br w:val="nil"/>
+              <w:tr2bl w:val="nil"/>
+            </w:tcBorders>
+            <w:noWrap w:val="0"/>
+            <w:vAlign w:val="top"/>
+          </w:tcPr>
           <w:p>
+            <w:pPr>
+              <w:spacing w:beforeLines="0" w:afterLines="0"/>
+              <w:jc w:val="center"/>
+              <w:rPr>
+                <w:rFonts w:hint="eastAsia" w:ascii="Times New Roman" w:hAnsi="Times New Roman" w:eastAsia="Times New Roman"/>
+                <w:b/>
+                <w:color w:val="000000"/>
+                <w:sz w:val="22"/>
+                <w:szCs w:val="24"/>
+              </w:rPr>
+            </w:pPr>
             <w:r>
               <w:rPr>
+                <w:rFonts w:hint="eastAsia" w:ascii="Times New Roman" w:hAnsi="Times New Roman" w:eastAsia="Times New Roman"/>
                 <w:b/>
+                <w:color w:val="000000"/>
+                <w:sz w:val="22"/>
+                <w:szCs w:val="24"/>
               </w:rPr>
-              <w:t>THÀNH TIỀN (VNĐ)</w:t>
+              <w:t xml:space="preserve"> THÀNH TIỀN (VNĐ) </w:t>
             </w:r>
           </w:p>
         </w:tc>
       </w:tr>
       <w:tr>
+        <w:tblPrEx>
+          <w:tblBorders>
+            <w:top w:val="none" w:color="auto" w:sz="0" w:space="0"/>
+            <w:left w:val="none" w:color="auto" w:sz="0" w:space="0"/>
+            <w:bottom w:val="none" w:color="auto" w:sz="0" w:space="0"/>
+            <w:right w:val="none" w:color="auto" w:sz="0" w:space="0"/>
+            <w:insideH w:val="none" w:color="auto" w:sz="0" w:space="0"/>
+            <w:insideV w:val="none" w:color="auto" w:sz="0" w:space="0"/>
+          </w:tblBorders>
+          <w:tblCellMar>
+            <w:top w:w="0" w:type="dxa"/>
+            <w:left w:w="108" w:type="dxa"/>
+            <w:bottom w:w="0" w:type="dxa"/>
+            <w:right w:w="108" w:type="dxa"/>
+          </w:tblCellMar>
+        </w:tblPrEx>
+        <w:trPr>
+          <w:trHeight w:val="420" w:hRule="atLeast"/>
+        </w:trPr>
         <w:tc>
           <w:tcPr>
-            <w:gridSpan w:val="6"/>
+            <w:tcW w:w="731" w:type="dxa"/>
+            <w:tcBorders>
+              <w:top w:val="single" w:color="auto" w:sz="6" w:space="0"/>
+              <w:left w:val="single" w:color="auto" w:sz="6" w:space="0"/>
+              <w:bottom w:val="single" w:color="auto" w:sz="6" w:space="0"/>
+              <w:right w:val="single" w:color="auto" w:sz="6" w:space="0"/>
+              <w:tl2br w:val="nil"/>
+              <w:tr2bl w:val="nil"/>
+            </w:tcBorders>
+            <w:noWrap w:val="0"/>
+            <w:vAlign w:val="top"/>
           </w:tcPr>
           <w:p>
+            <w:pPr>
+              <w:spacing w:beforeLines="0" w:afterLines="0"/>
+              <w:jc w:val="center"/>
+              <w:rPr>
+                <w:rFonts w:hint="eastAsia" w:ascii="Times New Roman" w:hAnsi="Times New Roman" w:eastAsia="Times New Roman"/>
+                <w:color w:val="000000"/>
+                <w:sz w:val="22"/>
+                <w:szCs w:val="24"/>
+              </w:rPr>
+            </w:pPr>
             <w:r>
-              <w:t>{#DichVuBaoGia}</w:t>
+              <w:rPr>
+                <w:rFonts w:hint="default" w:ascii="Times New Roman" w:hAnsi="Times New Roman" w:eastAsia="SimSun" w:cs="Times New Roman"/>
+                <w:sz w:val="22"/>
+                <w:szCs w:val="22"/>
+              </w:rPr>
+              <w:t>{#DanhSachChiPhi} {STT}</w:t>
+            </w:r>
+          </w:p>
+        </w:tc>
+        <w:tc>
+          <w:tcPr>
+            <w:tcW w:w="2809" w:type="dxa"/>
+            <w:tcBorders>
+              <w:top w:val="single" w:color="auto" w:sz="6" w:space="0"/>
+              <w:left w:val="single" w:color="auto" w:sz="6" w:space="0"/>
+              <w:bottom w:val="single" w:color="auto" w:sz="6" w:space="0"/>
+              <w:right w:val="single" w:color="auto" w:sz="6" w:space="0"/>
+              <w:tl2br w:val="nil"/>
+              <w:tr2bl w:val="nil"/>
+            </w:tcBorders>
+            <w:noWrap w:val="0"/>
+            <w:vAlign w:val="top"/>
+          </w:tcPr>
+          <w:p>
+            <w:pPr>
+              <w:spacing w:beforeLines="0" w:afterLines="0"/>
+              <w:jc w:val="left"/>
+              <w:rPr>
+                <w:rFonts w:hint="eastAsia" w:ascii="Times New Roman" w:hAnsi="Times New Roman" w:eastAsia="Times New Roman"/>
+                <w:color w:val="000000"/>
+                <w:sz w:val="24"/>
+                <w:szCs w:val="24"/>
+              </w:rPr>
+            </w:pPr>
+            <w:r>
+              <w:rPr>
+                <w:rFonts w:hint="eastAsia" w:ascii="Times New Roman" w:hAnsi="Times New Roman" w:eastAsia="Times New Roman"/>
+                <w:color w:val="000000"/>
+                <w:sz w:val="24"/>
+                <w:szCs w:val="24"/>
+              </w:rPr>
+              <w:t>{NoiDung}</w:t>
+            </w:r>
+          </w:p>
+        </w:tc>
+        <w:tc>
+          <w:tcPr>
+            <w:tcW w:w="1485" w:type="dxa"/>
+            <w:tcBorders>
+              <w:top w:val="single" w:color="auto" w:sz="6" w:space="0"/>
+              <w:left w:val="single" w:color="auto" w:sz="6" w:space="0"/>
+              <w:bottom w:val="single" w:color="auto" w:sz="6" w:space="0"/>
+              <w:right w:val="single" w:color="auto" w:sz="6" w:space="0"/>
+              <w:tl2br w:val="nil"/>
+              <w:tr2bl w:val="nil"/>
+            </w:tcBorders>
+            <w:noWrap w:val="0"/>
+            <w:vAlign w:val="top"/>
+          </w:tcPr>
+          <w:p>
+            <w:pPr>
+              <w:spacing w:beforeLines="0" w:afterLines="0"/>
+              <w:jc w:val="center"/>
+              <w:rPr>
+                <w:rFonts w:hint="eastAsia" w:ascii="Times New Roman" w:hAnsi="Times New Roman" w:eastAsia="Times New Roman"/>
+                <w:color w:val="000000"/>
+                <w:sz w:val="24"/>
+                <w:szCs w:val="24"/>
+              </w:rPr>
+            </w:pPr>
+            <w:r>
+              <w:rPr>
+                <w:rFonts w:hint="eastAsia" w:ascii="Times New Roman" w:hAnsi="Times New Roman" w:eastAsia="Times New Roman"/>
+                <w:color w:val="000000"/>
+                <w:sz w:val="24"/>
+                <w:szCs w:val="24"/>
+              </w:rPr>
+              <w:t>{DVT}</w:t>
+            </w:r>
+          </w:p>
+        </w:tc>
+        <w:tc>
+          <w:tcPr>
+            <w:tcW w:w="1515" w:type="dxa"/>
+            <w:tcBorders>
+              <w:top w:val="single" w:color="auto" w:sz="6" w:space="0"/>
+              <w:left w:val="single" w:color="auto" w:sz="6" w:space="0"/>
+              <w:bottom w:val="single" w:color="auto" w:sz="6" w:space="0"/>
+              <w:right w:val="single" w:color="auto" w:sz="6" w:space="0"/>
+              <w:tl2br w:val="nil"/>
+              <w:tr2bl w:val="nil"/>
+            </w:tcBorders>
+            <w:noWrap w:val="0"/>
+            <w:vAlign w:val="top"/>
+          </w:tcPr>
+          <w:p>
+            <w:pPr>
+              <w:spacing w:beforeLines="0" w:afterLines="0"/>
+              <w:jc w:val="center"/>
+              <w:rPr>
+                <w:rFonts w:hint="eastAsia" w:ascii="Times New Roman" w:hAnsi="Times New Roman" w:eastAsia="Times New Roman"/>
+                <w:color w:val="000000"/>
+                <w:sz w:val="24"/>
+                <w:szCs w:val="24"/>
+              </w:rPr>
+            </w:pPr>
+            <w:r>
+              <w:rPr>
+                <w:rFonts w:hint="eastAsia" w:ascii="Times New Roman" w:hAnsi="Times New Roman" w:eastAsia="Times New Roman"/>
+                <w:color w:val="000000"/>
+                <w:sz w:val="24"/>
+                <w:szCs w:val="24"/>
+              </w:rPr>
+              <w:t>{SoLuong}</w:t>
+            </w:r>
+          </w:p>
+        </w:tc>
+        <w:tc>
+          <w:tcPr>
+            <w:tcW w:w="1380" w:type="dxa"/>
+            <w:tcBorders>
+              <w:top w:val="single" w:color="auto" w:sz="6" w:space="0"/>
+              <w:left w:val="single" w:color="auto" w:sz="6" w:space="0"/>
+              <w:bottom w:val="single" w:color="auto" w:sz="6" w:space="0"/>
+              <w:right w:val="single" w:color="auto" w:sz="6" w:space="0"/>
+              <w:tl2br w:val="nil"/>
+              <w:tr2bl w:val="nil"/>
+            </w:tcBorders>
+            <w:noWrap w:val="0"/>
+            <w:vAlign w:val="top"/>
+          </w:tcPr>
+          <w:p>
+            <w:pPr>
+              <w:spacing w:beforeLines="0" w:afterLines="0"/>
+              <w:jc w:val="center"/>
+              <w:rPr>
+                <w:rFonts w:hint="eastAsia" w:ascii="Times New Roman" w:hAnsi="Times New Roman" w:eastAsia="Times New Roman"/>
+                <w:color w:val="000000"/>
+                <w:sz w:val="24"/>
+                <w:szCs w:val="24"/>
+              </w:rPr>
+            </w:pPr>
+            <w:r>
+              <w:rPr>
+                <w:rFonts w:hint="default"/>
+              </w:rPr>
+              <w:t>{DonGia}</w:t>
+            </w:r>
+          </w:p>
+        </w:tc>
+        <w:tc>
+          <w:tcPr>
+            <w:tcW w:w="1785" w:type="dxa"/>
+            <w:tcBorders>
+              <w:top w:val="single" w:color="auto" w:sz="6" w:space="0"/>
+              <w:left w:val="single" w:color="auto" w:sz="6" w:space="0"/>
+              <w:bottom w:val="single" w:color="auto" w:sz="6" w:space="0"/>
+              <w:right w:val="single" w:color="auto" w:sz="6" w:space="0"/>
+              <w:tl2br w:val="nil"/>
+              <w:tr2bl w:val="nil"/>
+            </w:tcBorders>
+            <w:noWrap w:val="0"/>
+            <w:vAlign w:val="top"/>
+          </w:tcPr>
+          <w:p>
+            <w:pPr>
+              <w:spacing w:beforeLines="0" w:afterLines="0"/>
+              <w:jc w:val="center"/>
+              <w:rPr>
+                <w:rFonts w:hint="eastAsia" w:ascii="Times New Roman" w:hAnsi="Times New Roman" w:eastAsia="Times New Roman"/>
+                <w:color w:val="000000"/>
+                <w:sz w:val="24"/>
+                <w:szCs w:val="24"/>
+              </w:rPr>
+            </w:pPr>
+            <w:r>
+              <w:rPr>
+                <w:rFonts w:hint="default" w:ascii="Times New Roman" w:hAnsi="Times New Roman" w:eastAsia="SimSun" w:cs="Times New Roman"/>
+                <w:b w:val="0"/>
+                <w:bCs w:val="0"/>
+                <w:sz w:val="22"/>
+                <w:szCs w:val="22"/>
+              </w:rPr>
+              <w:t>{ThanhTien} {/DanhSachChiPhi}</w:t>
+            </w:r>
+            <w:r>
+              <w:rPr>
+                <w:rFonts w:hint="eastAsia" w:ascii="Times New Roman" w:hAnsi="Times New Roman" w:eastAsia="Times New Roman"/>
+                <w:b w:val="0"/>
+                <w:bCs w:val="0"/>
+                <w:color w:val="000000"/>
+                <w:sz w:val="22"/>
+                <w:szCs w:val="22"/>
+              </w:rPr>
+              <w:t xml:space="preserve"> </w:t>
+            </w:r>
+            <w:r>
+              <w:rPr>
+                <w:rFonts w:hint="eastAsia" w:ascii="Times New Roman" w:hAnsi="Times New Roman" w:eastAsia="Times New Roman"/>
+                <w:color w:val="000000"/>
+                <w:sz w:val="22"/>
+                <w:szCs w:val="22"/>
+              </w:rPr>
+              <w:t xml:space="preserve"> </w:t>
+            </w:r>
+            <w:r>
+              <w:rPr>
+                <w:rFonts w:hint="eastAsia" w:ascii="Times New Roman" w:hAnsi="Times New Roman" w:eastAsia="Times New Roman"/>
+                <w:color w:val="000000"/>
+                <w:sz w:val="24"/>
+                <w:szCs w:val="24"/>
+              </w:rPr>
+              <w:t xml:space="preserve"> </w:t>
             </w:r>
           </w:p>
         </w:tc>
       </w:tr>
       <w:tr>
+        <w:tblPrEx>
+          <w:tblBorders>
+            <w:top w:val="none" w:color="auto" w:sz="0" w:space="0"/>
+            <w:left w:val="none" w:color="auto" w:sz="0" w:space="0"/>
+            <w:bottom w:val="none" w:color="auto" w:sz="0" w:space="0"/>
+            <w:right w:val="none" w:color="auto" w:sz="0" w:space="0"/>
+            <w:insideH w:val="none" w:color="auto" w:sz="0" w:space="0"/>
+            <w:insideV w:val="none" w:color="auto" w:sz="0" w:space="0"/>
+          </w:tblBorders>
+          <w:tblCellMar>
+            <w:top w:w="0" w:type="dxa"/>
+            <w:left w:w="108" w:type="dxa"/>
+            <w:bottom w:w="0" w:type="dxa"/>
+            <w:right w:w="108" w:type="dxa"/>
+          </w:tblCellMar>
+        </w:tblPrEx>
+        <w:trPr>
+          <w:trHeight w:val="480" w:hRule="atLeast"/>
+        </w:trPr>
         <w:tc>
+          <w:tcPr>
+            <w:tcW w:w="7920" w:type="dxa"/>
+            <w:gridSpan w:val="5"/>
+            <w:tcBorders>
+              <w:top w:val="single" w:color="auto" w:sz="6" w:space="0"/>
+              <w:left w:val="single" w:color="auto" w:sz="6" w:space="0"/>
+              <w:bottom w:val="single" w:color="auto" w:sz="6" w:space="0"/>
+              <w:right w:val="single" w:color="auto" w:sz="6" w:space="0"/>
+              <w:tl2br w:val="nil"/>
+              <w:tr2bl w:val="nil"/>
+            </w:tcBorders>
+            <w:noWrap w:val="0"/>
+            <w:vAlign w:val="top"/>
+          </w:tcPr>
           <w:p>
+            <w:pPr>
+              <w:spacing w:beforeLines="0" w:afterLines="0"/>
+              <w:jc w:val="center"/>
+              <w:rPr>
+                <w:rFonts w:hint="eastAsia" w:ascii="Times New Roman" w:hAnsi="Times New Roman" w:eastAsia="Times New Roman"/>
+                <w:b/>
+                <w:color w:val="000000"/>
+                <w:sz w:val="22"/>
+                <w:szCs w:val="24"/>
+              </w:rPr>
+            </w:pPr>
             <w:r>
-              <w:t>{STT}</w:t>
+              <w:rPr>
+                <w:rFonts w:hint="eastAsia" w:ascii="Times New Roman" w:hAnsi="Times New Roman" w:eastAsia="Times New Roman"/>
+                <w:b/>
+                <w:color w:val="000000"/>
+                <w:sz w:val="22"/>
+                <w:szCs w:val="24"/>
+              </w:rPr>
+              <w:t xml:space="preserve">Tổng giá trị Hợp Đồng tạm tính </w:t>
             </w:r>
           </w:p>
         </w:tc>
         <w:tc>
-          <w:p>
-            <w:r>
-              <w:t>{NoiDung}</w:t>
-            </w:r>
-          </w:p>
-        </w:tc>
-        <w:tc>
-          <w:p>
-            <w:r>
-              <w:t>{DVT}</w:t>
-            </w:r>
-          </w:p>
-        </w:tc>
-        <w:tc>
-          <w:p>
-            <w:r>
-              <w:t>{SL}</w:t>
-            </w:r>
-          </w:p>
-        </w:tc>
-        <w:tc>
-          <w:p>
-            <w:r>
-              <w:t>{DonGia}</w:t>
-            </w:r>
-          </w:p>
-        </w:tc>
-        <w:tc>
-          <w:p>
-            <w:r>
-              <w:t>{ThanhTien}</w:t>
-            </w:r>
-          </w:p>
-        </w:tc>
-      </w:tr>
-      <w:tr>
-        <w:tc>
           <w:tcPr>
-            <w:gridSpan w:val="6"/>
+            <w:tcW w:w="1785" w:type="dxa"/>
+            <w:tcBorders>
+              <w:top w:val="single" w:color="auto" w:sz="6" w:space="0"/>
+              <w:left w:val="single" w:color="auto" w:sz="6" w:space="0"/>
+              <w:bottom w:val="single" w:color="auto" w:sz="6" w:space="0"/>
+              <w:right w:val="single" w:color="auto" w:sz="6" w:space="0"/>
+              <w:tl2br w:val="nil"/>
+              <w:tr2bl w:val="nil"/>
+            </w:tcBorders>
+            <w:noWrap w:val="0"/>
+            <w:vAlign w:val="top"/>
           </w:tcPr>
           <w:p>
-            <w:r>
-              <w:t>{/DichVuBaoGia}</w:t>
-            </w:r>
-          </w:p>
-        </w:tc>
-      </w:tr>
-      <w:tr>
-        <w:tc>
-          <w:tcPr>
-            <w:gridSpan w:val="5"/>
-          </w:tcPr>
-          <w:p>
+            <w:pPr>
+              <w:spacing w:beforeLines="0" w:afterLines="0"/>
+              <w:jc w:val="center"/>
+              <w:rPr>
+                <w:rFonts w:hint="eastAsia" w:ascii="Times New Roman" w:hAnsi="Times New Roman" w:eastAsia="Times New Roman"/>
+                <w:b/>
+                <w:color w:val="000000"/>
+                <w:sz w:val="24"/>
+                <w:szCs w:val="24"/>
+              </w:rPr>
+            </w:pPr>
             <w:r>
               <w:rPr>
-                <w:b/>
+                <w:rFonts w:hint="default" w:ascii="Times New Roman" w:hAnsi="Times New Roman" w:eastAsia="SimSun" w:cs="Times New Roman"/>
+                <w:sz w:val="22"/>
+                <w:szCs w:val="22"/>
               </w:rPr>
-              <w:t>Tổng giá trị Hợp Đồng tạm tính</w:t>
-            </w:r>
-          </w:p>
-        </w:tc>
-        <w:tc>
-          <w:p>
-            <w:r>
-              <w:rPr>
-                <w:b/>
-              </w:rPr>
-              <w:t>{TongTien}</w:t>
+              <w:t>{TongGiaTriTamTinh}</w:t>
             </w:r>
           </w:p>
         </w:tc>
@@ -2404,6 +3952,21 @@
     </w:tbl>
     <w:p>
       <w:pPr>
+        <w:pStyle w:val="13"/>
+        <w:tabs>
+          <w:tab w:val="left" w:pos="600"/>
+          <w:tab w:val="left" w:pos="9450"/>
+        </w:tabs>
+        <w:spacing w:before="80"/>
+        <w:ind w:left="270" w:right="180" w:firstLine="90"/>
+        <w:rPr>
+          <w:b/>
+          <w:sz w:val="24"/>
+        </w:rPr>
+      </w:pPr>
+    </w:p>
+    <w:p>
+      <w:pPr>
         <w:pStyle w:val="5"/>
         <w:spacing w:before="11"/>
         <w:rPr>
@@ -2490,7 +4053,7 @@
     </w:p>
     <w:p>
       <w:pPr>
-        <w:pStyle w:val="12"/>
+        <w:pStyle w:val="13"/>
         <w:numPr>
           <w:ilvl w:val="0"/>
           <w:numId w:val="6"/>
@@ -2513,7 +4076,7 @@
     </w:p>
     <w:p>
       <w:pPr>
-        <w:pStyle w:val="12"/>
+        <w:pStyle w:val="13"/>
         <w:numPr>
           <w:ilvl w:val="0"/>
           <w:numId w:val="6"/>
@@ -2543,7 +4106,7 @@
     </w:p>
     <w:p>
       <w:pPr>
-        <w:pStyle w:val="12"/>
+        <w:pStyle w:val="13"/>
         <w:numPr>
           <w:ilvl w:val="0"/>
           <w:numId w:val="6"/>
@@ -2558,12 +4121,44 @@
         </w:rPr>
       </w:pPr>
       <w:r>
-        <w:t>ký ngày {NgayKyHopDong}</w:t>
-      </w:r>
-    </w:p>
-    <w:p>
-      <w:pPr>
-        <w:pStyle w:val="12"/>
+        <w:rPr>
+          <w:sz w:val="24"/>
+        </w:rPr>
+        <w:t xml:space="preserve">Các nội dung không được sửa đổi, bổ sung tại Phụ lục này vẫn được thực hiện theo Hợp đồng tổ chức tiệc số </w:t>
+      </w:r>
+      <w:r>
+        <w:rPr>
+          <w:rFonts w:hint="default"/>
+          <w:sz w:val="24"/>
+          <w:lang w:val="en-US"/>
+        </w:rPr>
+        <w:t>{Sohopdong}</w:t>
+      </w:r>
+      <w:r>
+        <w:rPr>
+          <w:sz w:val="24"/>
+        </w:rPr>
+        <w:t xml:space="preserve"> ký ngày </w:t>
+      </w:r>
+      <w:r>
+        <w:rPr>
+          <w:rFonts w:hint="default"/>
+          <w:sz w:val="24"/>
+        </w:rPr>
+        <w:t>{NgayLapHD}/{ThangLapHD}/{NamLapHD}</w:t>
+      </w:r>
+      <w:r>
+        <w:rPr>
+          <w:rFonts w:hint="default"/>
+          <w:sz w:val="24"/>
+          <w:lang w:val="en-US"/>
+        </w:rPr>
+        <w:t>.</w:t>
+      </w:r>
+    </w:p>
+    <w:p>
+      <w:pPr>
+        <w:pStyle w:val="13"/>
         <w:tabs>
           <w:tab w:val="left" w:pos="540"/>
         </w:tabs>
@@ -2628,7 +4223,7 @@
     </w:p>
     <w:p>
       <w:pPr>
-        <w:pStyle w:val="12"/>
+        <w:pStyle w:val="13"/>
         <w:numPr>
           <w:ilvl w:val="1"/>
           <w:numId w:val="6"/>
@@ -2717,7 +4312,7 @@
     </w:p>
     <w:p>
       <w:pPr>
-        <w:pStyle w:val="12"/>
+        <w:pStyle w:val="13"/>
         <w:numPr>
           <w:ilvl w:val="1"/>
           <w:numId w:val="6"/>
@@ -2732,12 +4327,81 @@
         </w:rPr>
       </w:pPr>
       <w:r>
-        <w:t>HĐ số: {SoHopDong}</w:t>
-      </w:r>
-    </w:p>
-    <w:p>
-      <w:pPr>
-        <w:pStyle w:val="12"/>
+        <w:rPr>
+          <w:sz w:val="24"/>
+        </w:rPr>
+        <w:t>Phụ lục này</w:t>
+      </w:r>
+      <w:r>
+        <w:rPr>
+          <w:spacing w:val="-2"/>
+          <w:sz w:val="24"/>
+        </w:rPr>
+        <w:t xml:space="preserve"> </w:t>
+      </w:r>
+      <w:r>
+        <w:rPr>
+          <w:sz w:val="24"/>
+        </w:rPr>
+        <w:t xml:space="preserve">là một phần không thể tách rời của </w:t>
+      </w:r>
+      <w:r>
+        <w:rPr>
+          <w:b/>
+          <w:sz w:val="24"/>
+        </w:rPr>
+        <w:t>HĐ số:</w:t>
+      </w:r>
+      <w:r>
+        <w:rPr>
+          <w:b/>
+          <w:sz w:val="24"/>
+          <w:lang w:val="en-US"/>
+        </w:rPr>
+        <w:t xml:space="preserve">  </w:t>
+      </w:r>
+      <w:r>
+        <w:rPr>
+          <w:rFonts w:hint="default"/>
+          <w:sz w:val="24"/>
+          <w:lang w:val="en-US"/>
+        </w:rPr>
+        <w:t>{Sohopdong}</w:t>
+      </w:r>
+      <w:r>
+        <w:rPr>
+          <w:b/>
+          <w:sz w:val="24"/>
+        </w:rPr>
+        <w:t>, ký ngày</w:t>
+      </w:r>
+      <w:r>
+        <w:rPr>
+          <w:b/>
+          <w:sz w:val="24"/>
+          <w:lang w:val="en-US"/>
+        </w:rPr>
+        <w:t xml:space="preserve"> </w:t>
+      </w:r>
+      <w:r>
+        <w:rPr>
+          <w:rFonts w:hint="default"/>
+          <w:sz w:val="24"/>
+        </w:rPr>
+        <w:t>{NgayLapHD}/{ThangLapHD}/{NamLapHD}</w:t>
+      </w:r>
+      <w:r>
+        <w:rPr>
+          <w:rFonts w:hint="default"/>
+          <w:sz w:val="24"/>
+          <w:lang w:val="en-US"/>
+        </w:rPr>
+        <w:t>.</w:t>
+      </w:r>
+    </w:p>
+    <w:p>
+      <w:pPr>
+        <w:pStyle w:val="13"/>
         <w:numPr>
           <w:ilvl w:val="1"/>
           <w:numId w:val="6"/>
@@ -2762,7 +4426,7 @@
     </w:p>
     <w:p>
       <w:pPr>
-        <w:pStyle w:val="12"/>
+        <w:pStyle w:val="13"/>
         <w:numPr>
           <w:ilvl w:val="1"/>
           <w:numId w:val="6"/>
@@ -2806,7 +4470,7 @@
     </w:p>
     <w:p>
       <w:pPr>
-        <w:pStyle w:val="12"/>
+        <w:pStyle w:val="13"/>
         <w:tabs>
           <w:tab w:val="left" w:pos="631"/>
         </w:tabs>
@@ -3084,7 +4748,74 @@
         </w:rPr>
       </w:pPr>
       <w:r>
-        <w:t>Ông/Bà: {BenB_TenDaiDien}</w:t>
+        <w:rPr>
+          <w:b/>
+          <w:sz w:val="24"/>
+          <w:lang w:val="en-US"/>
+        </w:rPr>
+        <w:t>Ông</w:t>
+      </w:r>
+      <w:r>
+        <w:rPr>
+          <w:b/>
+          <w:sz w:val="24"/>
+        </w:rPr>
+        <w:t xml:space="preserve">: </w:t>
+      </w:r>
+      <w:r>
+        <w:rPr>
+          <w:rFonts w:hint="default"/>
+          <w:b/>
+          <w:sz w:val="24"/>
+          <w:szCs w:val="24"/>
+          <w:lang w:val="fr-FR"/>
+        </w:rPr>
+        <w:t>{BenADaiDien}</w:t>
+      </w:r>
+      <w:r>
+        <w:rPr>
+          <w:b/>
+          <w:sz w:val="24"/>
+          <w:szCs w:val="24"/>
+          <w:lang w:val="fr-FR"/>
+        </w:rPr>
+        <w:tab/>
+      </w:r>
+      <w:r>
+        <w:rPr>
+          <w:b/>
+          <w:sz w:val="24"/>
+          <w:szCs w:val="24"/>
+          <w:lang w:val="fr-FR"/>
+        </w:rPr>
+        <w:tab/>
+      </w:r>
+      <w:r>
+        <w:rPr>
+          <w:b/>
+          <w:spacing w:val="-2"/>
+          <w:sz w:val="24"/>
+        </w:rPr>
+        <w:t>Ông/Bà:</w:t>
+      </w:r>
+      <w:r>
+        <w:rPr>
+          <w:b/>
+          <w:bCs/>
+          <w:sz w:val="24"/>
+          <w:szCs w:val="24"/>
+        </w:rPr>
+        <w:t xml:space="preserve"> </w:t>
+      </w:r>
+      <w:r>
+        <w:rPr>
+          <w:rFonts w:hint="default"/>
+          <w:b/>
+          <w:bCs/>
+          <w:sz w:val="24"/>
+          <w:szCs w:val="24"/>
+        </w:rPr>
+        <w:t>{BenBTenDaiDien}</w:t>
       </w:r>
     </w:p>
     <w:p>
@@ -3104,7 +4835,17 @@
           <w:szCs w:val="24"/>
           <w:lang w:val="fr-FR"/>
         </w:rPr>
-        <w:t>Chức vụ : Giám Đốc</w:t>
+        <w:t xml:space="preserve">Chức vụ : </w:t>
+      </w:r>
+      <w:r>
+        <w:rPr>
+          <w:rFonts w:hint="default"/>
+          <w:b/>
+          <w:sz w:val="24"/>
+          <w:szCs w:val="24"/>
+          <w:lang w:val="fr-FR"/>
+        </w:rPr>
+        <w:t>{BenAChucVuDaiDien}</w:t>
       </w:r>
       <w:r>
         <w:rPr>
@@ -3223,119 +4964,6 @@
 <file path=word/numbering.xml><?xml version="1.0" encoding="utf-8"?>
 <w:numbering xmlns:wpc="http://schemas.microsoft.com/office/word/2010/wordprocessingCanvas" xmlns:mc="http://schemas.openxmlformats.org/markup-compatibility/2006" xmlns:o="urn:schemas-microsoft-com:office:office" xmlns:r="http://schemas.openxmlformats.org/officeDocument/2006/relationships" xmlns:m="http://schemas.openxmlformats.org/officeDocument/2006/math" xmlns:v="urn:schemas-microsoft-com:vml" xmlns:wp14="http://schemas.microsoft.com/office/word/2010/wordprocessingDrawing" xmlns:wp="http://schemas.openxmlformats.org/drawingml/2006/wordprocessingDrawing" xmlns:w10="urn:schemas-microsoft-com:office:word" xmlns:w="http://schemas.openxmlformats.org/wordprocessingml/2006/main" xmlns:w14="http://schemas.microsoft.com/office/word/2010/wordml" xmlns:wpg="http://schemas.microsoft.com/office/word/2010/wordprocessingGroup" xmlns:wpi="http://schemas.microsoft.com/office/word/2010/wordprocessingInk" xmlns:wne="http://schemas.microsoft.com/office/word/2006/wordml" xmlns:wps="http://schemas.microsoft.com/office/word/2010/wordprocessingShape" xmlns:wpsCustomData="http://www.wps.cn/officeDocument/2013/wpsCustomData" mc:Ignorable="w14 wp14">
   <w:abstractNum w:abstractNumId="0">
-    <w:nsid w:val="055F374D"/>
-    <w:multiLevelType w:val="multilevel"/>
-    <w:tmpl w:val="055F374D"/>
-    <w:lvl w:ilvl="0" w:tentative="0">
-      <w:start w:val="1"/>
-      <w:numFmt w:val="bullet"/>
-      <w:lvlText w:val=""/>
-      <w:lvlJc w:val="left"/>
-      <w:pPr>
-        <w:ind w:left="1080" w:hanging="360"/>
-      </w:pPr>
-      <w:rPr>
-        <w:rFonts w:hint="default" w:ascii="Symbol" w:hAnsi="Symbol"/>
-      </w:rPr>
-    </w:lvl>
-    <w:lvl w:ilvl="1" w:tentative="0">
-      <w:start w:val="1"/>
-      <w:numFmt w:val="bullet"/>
-      <w:lvlText w:val="o"/>
-      <w:lvlJc w:val="left"/>
-      <w:pPr>
-        <w:ind w:left="1800" w:hanging="360"/>
-      </w:pPr>
-      <w:rPr>
-        <w:rFonts w:hint="default" w:ascii="Courier New" w:hAnsi="Courier New" w:cs="Courier New"/>
-      </w:rPr>
-    </w:lvl>
-    <w:lvl w:ilvl="2" w:tentative="0">
-      <w:start w:val="1"/>
-      <w:numFmt w:val="bullet"/>
-      <w:lvlText w:val=""/>
-      <w:lvlJc w:val="left"/>
-      <w:pPr>
-        <w:ind w:left="2520" w:hanging="360"/>
-      </w:pPr>
-      <w:rPr>
-        <w:rFonts w:hint="default" w:ascii="Wingdings" w:hAnsi="Wingdings"/>
-      </w:rPr>
-    </w:lvl>
-    <w:lvl w:ilvl="3" w:tentative="0">
-      <w:start w:val="1"/>
-      <w:numFmt w:val="bullet"/>
-      <w:lvlText w:val=""/>
-      <w:lvlJc w:val="left"/>
-      <w:pPr>
-        <w:ind w:left="3240" w:hanging="360"/>
-      </w:pPr>
-      <w:rPr>
-        <w:rFonts w:hint="default" w:ascii="Symbol" w:hAnsi="Symbol"/>
-      </w:rPr>
-    </w:lvl>
-    <w:lvl w:ilvl="4" w:tentative="0">
-      <w:start w:val="1"/>
-      <w:numFmt w:val="bullet"/>
-      <w:lvlText w:val="o"/>
-      <w:lvlJc w:val="left"/>
-      <w:pPr>
-        <w:ind w:left="3960" w:hanging="360"/>
-      </w:pPr>
-      <w:rPr>
-        <w:rFonts w:hint="default" w:ascii="Courier New" w:hAnsi="Courier New" w:cs="Courier New"/>
-      </w:rPr>
-    </w:lvl>
-    <w:lvl w:ilvl="5" w:tentative="0">
-      <w:start w:val="1"/>
-      <w:numFmt w:val="bullet"/>
-      <w:lvlText w:val=""/>
-      <w:lvlJc w:val="left"/>
-      <w:pPr>
-        <w:ind w:left="4680" w:hanging="360"/>
-      </w:pPr>
-      <w:rPr>
-        <w:rFonts w:hint="default" w:ascii="Wingdings" w:hAnsi="Wingdings"/>
-      </w:rPr>
-    </w:lvl>
-    <w:lvl w:ilvl="6" w:tentative="0">
-      <w:start w:val="1"/>
-      <w:numFmt w:val="bullet"/>
-      <w:lvlText w:val=""/>
-      <w:lvlJc w:val="left"/>
-      <w:pPr>
-        <w:ind w:left="5400" w:hanging="360"/>
-      </w:pPr>
-      <w:rPr>
-        <w:rFonts w:hint="default" w:ascii="Symbol" w:hAnsi="Symbol"/>
-      </w:rPr>
-    </w:lvl>
-    <w:lvl w:ilvl="7" w:tentative="0">
-      <w:start w:val="1"/>
-      <w:numFmt w:val="bullet"/>
-      <w:lvlText w:val="o"/>
-      <w:lvlJc w:val="left"/>
-      <w:pPr>
-        <w:ind w:left="6120" w:hanging="360"/>
-      </w:pPr>
-      <w:rPr>
-        <w:rFonts w:hint="default" w:ascii="Courier New" w:hAnsi="Courier New" w:cs="Courier New"/>
-      </w:rPr>
-    </w:lvl>
-    <w:lvl w:ilvl="8" w:tentative="0">
-      <w:start w:val="1"/>
-      <w:numFmt w:val="bullet"/>
-      <w:lvlText w:val=""/>
-      <w:lvlJc w:val="left"/>
-      <w:pPr>
-        <w:ind w:left="6840" w:hanging="360"/>
-      </w:pPr>
-      <w:rPr>
-        <w:rFonts w:hint="default" w:ascii="Wingdings" w:hAnsi="Wingdings"/>
-      </w:rPr>
-    </w:lvl>
-  </w:abstractNum>
-  <w:abstractNum w:abstractNumId="1">
     <w:nsid w:val="16590D4D"/>
     <w:multiLevelType w:val="multilevel"/>
     <w:tmpl w:val="16590D4D"/>
@@ -3473,7 +5101,7 @@
       </w:rPr>
     </w:lvl>
   </w:abstractNum>
-  <w:abstractNum w:abstractNumId="2">
+  <w:abstractNum w:abstractNumId="1">
     <w:nsid w:val="267340C6"/>
     <w:multiLevelType w:val="multilevel"/>
     <w:tmpl w:val="267340C6"/>
@@ -3586,7 +5214,7 @@
       </w:rPr>
     </w:lvl>
   </w:abstractNum>
-  <w:abstractNum w:abstractNumId="3">
+  <w:abstractNum w:abstractNumId="2">
     <w:nsid w:val="36D67A36"/>
     <w:multiLevelType w:val="multilevel"/>
     <w:tmpl w:val="36D67A36"/>
@@ -3710,7 +5338,7 @@
       </w:rPr>
     </w:lvl>
   </w:abstractNum>
-  <w:abstractNum w:abstractNumId="4">
+  <w:abstractNum w:abstractNumId="3">
     <w:nsid w:val="53AF36B2"/>
     <w:multiLevelType w:val="multilevel"/>
     <w:tmpl w:val="53AF36B2"/>
@@ -3823,113 +5451,40 @@
       </w:rPr>
     </w:lvl>
   </w:abstractNum>
-  <w:abstractNum w:abstractNumId="5">
-    <w:nsid w:val="6C5D096A"/>
-    <w:multiLevelType w:val="multilevel"/>
-    <w:tmpl w:val="6C5D096A"/>
+  <w:abstractNum w:abstractNumId="4">
+    <w:nsid w:val="7730C803"/>
+    <w:multiLevelType w:val="singleLevel"/>
+    <w:tmpl w:val="7730C803"/>
     <w:lvl w:ilvl="0" w:tentative="0">
       <w:start w:val="1"/>
       <w:numFmt w:val="bullet"/>
-      <w:lvlText w:val=""/>
+      <w:lvlText w:val=""/>
       <w:lvlJc w:val="left"/>
       <w:pPr>
-        <w:ind w:left="1080" w:hanging="360"/>
-      </w:pPr>
-      <w:rPr>
-        <w:rFonts w:hint="default" w:ascii="Symbol" w:hAnsi="Symbol"/>
-      </w:rPr>
-    </w:lvl>
-    <w:lvl w:ilvl="1" w:tentative="0">
-      <w:start w:val="1"/>
-      <w:numFmt w:val="bullet"/>
-      <w:lvlText w:val="o"/>
-      <w:lvlJc w:val="left"/>
-      <w:pPr>
-        <w:ind w:left="1800" w:hanging="360"/>
-      </w:pPr>
-      <w:rPr>
-        <w:rFonts w:hint="default" w:ascii="Courier New" w:hAnsi="Courier New" w:cs="Courier New"/>
-      </w:rPr>
-    </w:lvl>
-    <w:lvl w:ilvl="2" w:tentative="0">
-      <w:start w:val="1"/>
-      <w:numFmt w:val="bullet"/>
-      <w:lvlText w:val=""/>
-      <w:lvlJc w:val="left"/>
-      <w:pPr>
-        <w:ind w:left="2520" w:hanging="360"/>
+        <w:tabs>
+          <w:tab w:val="left" w:pos="420"/>
+        </w:tabs>
+        <w:ind w:left="420" w:leftChars="0" w:hanging="420" w:firstLineChars="0"/>
       </w:pPr>
       <w:rPr>
         <w:rFonts w:hint="default" w:ascii="Wingdings" w:hAnsi="Wingdings"/>
       </w:rPr>
     </w:lvl>
-    <w:lvl w:ilvl="3" w:tentative="0">
+  </w:abstractNum>
+  <w:abstractNum w:abstractNumId="5">
+    <w:nsid w:val="7C58BCE3"/>
+    <w:multiLevelType w:val="singleLevel"/>
+    <w:tmpl w:val="7C58BCE3"/>
+    <w:lvl w:ilvl="0" w:tentative="0">
       <w:start w:val="1"/>
       <w:numFmt w:val="bullet"/>
-      <w:lvlText w:val=""/>
+      <w:lvlText w:val=""/>
       <w:lvlJc w:val="left"/>
       <w:pPr>
-        <w:ind w:left="3240" w:hanging="360"/>
-      </w:pPr>
-      <w:rPr>
-        <w:rFonts w:hint="default" w:ascii="Symbol" w:hAnsi="Symbol"/>
-      </w:rPr>
-    </w:lvl>
-    <w:lvl w:ilvl="4" w:tentative="0">
-      <w:start w:val="1"/>
-      <w:numFmt w:val="bullet"/>
-      <w:lvlText w:val="o"/>
-      <w:lvlJc w:val="left"/>
-      <w:pPr>
-        <w:ind w:left="3960" w:hanging="360"/>
-      </w:pPr>
-      <w:rPr>
-        <w:rFonts w:hint="default" w:ascii="Courier New" w:hAnsi="Courier New" w:cs="Courier New"/>
-      </w:rPr>
-    </w:lvl>
-    <w:lvl w:ilvl="5" w:tentative="0">
-      <w:start w:val="1"/>
-      <w:numFmt w:val="bullet"/>
-      <w:lvlText w:val=""/>
-      <w:lvlJc w:val="left"/>
-      <w:pPr>
-        <w:ind w:left="4680" w:hanging="360"/>
-      </w:pPr>
-      <w:rPr>
-        <w:rFonts w:hint="default" w:ascii="Wingdings" w:hAnsi="Wingdings"/>
-      </w:rPr>
-    </w:lvl>
-    <w:lvl w:ilvl="6" w:tentative="0">
-      <w:start w:val="1"/>
-      <w:numFmt w:val="bullet"/>
-      <w:lvlText w:val=""/>
-      <w:lvlJc w:val="left"/>
-      <w:pPr>
-        <w:ind w:left="5400" w:hanging="360"/>
-      </w:pPr>
-      <w:rPr>
-        <w:rFonts w:hint="default" w:ascii="Symbol" w:hAnsi="Symbol"/>
-      </w:rPr>
-    </w:lvl>
-    <w:lvl w:ilvl="7" w:tentative="0">
-      <w:start w:val="1"/>
-      <w:numFmt w:val="bullet"/>
-      <w:lvlText w:val="o"/>
-      <w:lvlJc w:val="left"/>
-      <w:pPr>
-        <w:ind w:left="6120" w:hanging="360"/>
-      </w:pPr>
-      <w:rPr>
-        <w:rFonts w:hint="default" w:ascii="Courier New" w:hAnsi="Courier New" w:cs="Courier New"/>
-      </w:rPr>
-    </w:lvl>
-    <w:lvl w:ilvl="8" w:tentative="0">
-      <w:start w:val="1"/>
-      <w:numFmt w:val="bullet"/>
-      <w:lvlText w:val=""/>
-      <w:lvlJc w:val="left"/>
-      <w:pPr>
-        <w:ind w:left="6840" w:hanging="360"/>
+        <w:tabs>
+          <w:tab w:val="left" w:pos="420"/>
+        </w:tabs>
+        <w:ind w:left="420" w:leftChars="0" w:hanging="420" w:firstLineChars="0"/>
       </w:pPr>
       <w:rPr>
         <w:rFonts w:hint="default" w:ascii="Wingdings" w:hAnsi="Wingdings"/>
@@ -3937,22 +5492,22 @@
     </w:lvl>
   </w:abstractNum>
   <w:num w:numId="1">
+    <w:abstractNumId w:val="2"/>
+  </w:num>
+  <w:num w:numId="2">
     <w:abstractNumId w:val="3"/>
   </w:num>
-  <w:num w:numId="2">
+  <w:num w:numId="3">
+    <w:abstractNumId w:val="1"/>
+  </w:num>
+  <w:num w:numId="4">
+    <w:abstractNumId w:val="5"/>
+  </w:num>
+  <w:num w:numId="5">
     <w:abstractNumId w:val="4"/>
   </w:num>
-  <w:num w:numId="3">
-    <w:abstractNumId w:val="2"/>
-  </w:num>
-  <w:num w:numId="4">
+  <w:num w:numId="6">
     <w:abstractNumId w:val="0"/>
-  </w:num>
-  <w:num w:numId="5">
-    <w:abstractNumId w:val="5"/>
-  </w:num>
-  <w:num w:numId="6">
-    <w:abstractNumId w:val="1"/>
   </w:num>
 </w:numbering>
 </file>
@@ -3962,7 +5517,7 @@
   <w:docDefaults>
     <w:rPrDefault>
       <w:rPr>
-        <w:rFonts w:asciiTheme="minorHAnsi" w:hAnsiTheme="minorHAnsi" w:eastAsiaTheme="minorHAnsi" w:cstheme="minorBidi"/>
+        <w:rFonts w:ascii="Times New Roman" w:hAnsi="Times New Roman" w:eastAsia="SimSun" w:cs="Times New Roman"/>
       </w:rPr>
     </w:rPrDefault>
     <w:pPrDefault/>
@@ -4064,7 +5619,7 @@
     <w:lsdException w:uiPriority="99" w:name="HTML Acronym"/>
     <w:lsdException w:uiPriority="99" w:name="HTML Address"/>
     <w:lsdException w:uiPriority="99" w:name="HTML Cite"/>
-    <w:lsdException w:uiPriority="99" w:name="HTML Code"/>
+    <w:lsdException w:qFormat="1" w:uiPriority="99" w:name="HTML Code"/>
     <w:lsdException w:uiPriority="99" w:name="HTML Definition"/>
     <w:lsdException w:uiPriority="99" w:name="HTML Keyboard"/>
     <w:lsdException w:uiPriority="99" w:name="HTML Preformatted"/>
@@ -4237,7 +5792,7 @@
   <w:style w:type="paragraph" w:styleId="2">
     <w:name w:val="heading 1"/>
     <w:basedOn w:val="1"/>
-    <w:link w:val="9"/>
+    <w:link w:val="10"/>
     <w:qFormat/>
     <w:uiPriority w:val="9"/>
     <w:pPr>
@@ -4276,7 +5831,7 @@
   <w:style w:type="paragraph" w:styleId="5">
     <w:name w:val="Body Text"/>
     <w:basedOn w:val="1"/>
-    <w:link w:val="10"/>
+    <w:link w:val="11"/>
     <w:qFormat/>
     <w:uiPriority w:val="1"/>
     <w:rPr>
@@ -4287,7 +5842,7 @@
   <w:style w:type="paragraph" w:styleId="6">
     <w:name w:val="footer"/>
     <w:basedOn w:val="1"/>
-    <w:link w:val="15"/>
+    <w:link w:val="16"/>
     <w:unhideWhenUsed/>
     <w:qFormat/>
     <w:uiPriority w:val="99"/>
@@ -4301,7 +5856,7 @@
   <w:style w:type="paragraph" w:styleId="7">
     <w:name w:val="header"/>
     <w:basedOn w:val="1"/>
-    <w:link w:val="14"/>
+    <w:link w:val="15"/>
     <w:unhideWhenUsed/>
     <w:qFormat/>
     <w:uiPriority w:val="99"/>
@@ -4312,10 +5867,23 @@
       </w:tabs>
     </w:pPr>
   </w:style>
-  <w:style w:type="paragraph" w:styleId="8">
+  <w:style w:type="character" w:styleId="8">
+    <w:name w:val="HTML Code"/>
+    <w:basedOn w:val="3"/>
+    <w:semiHidden/>
+    <w:unhideWhenUsed/>
+    <w:qFormat/>
+    <w:uiPriority w:val="99"/>
+    <w:rPr>
+      <w:rFonts w:ascii="Courier New" w:hAnsi="Courier New" w:cs="Courier New"/>
+      <w:sz w:val="20"/>
+      <w:szCs w:val="20"/>
+    </w:rPr>
+  </w:style>
+  <w:style w:type="paragraph" w:styleId="9">
     <w:name w:val="Title"/>
     <w:basedOn w:val="1"/>
-    <w:link w:val="11"/>
+    <w:link w:val="12"/>
     <w:qFormat/>
     <w:uiPriority w:val="10"/>
     <w:pPr>
@@ -4330,7 +5898,7 @@
       <w:szCs w:val="40"/>
     </w:rPr>
   </w:style>
-  <w:style w:type="character" w:customStyle="1" w:styleId="9">
+  <w:style w:type="character" w:customStyle="1" w:styleId="10">
     <w:name w:val="Heading 1 Char"/>
     <w:basedOn w:val="3"/>
     <w:link w:val="2"/>
@@ -4345,7 +5913,7 @@
       <w:lang w:val="vi"/>
     </w:rPr>
   </w:style>
-  <w:style w:type="character" w:customStyle="1" w:styleId="10">
+  <w:style w:type="character" w:customStyle="1" w:styleId="11">
     <w:name w:val="Body Text Char"/>
     <w:basedOn w:val="3"/>
     <w:link w:val="5"/>
@@ -4358,10 +5926,10 @@
       <w:lang w:val="vi"/>
     </w:rPr>
   </w:style>
-  <w:style w:type="character" w:customStyle="1" w:styleId="11">
+  <w:style w:type="character" w:customStyle="1" w:styleId="12">
     <w:name w:val="Title Char"/>
     <w:basedOn w:val="3"/>
-    <w:link w:val="8"/>
+    <w:link w:val="9"/>
     <w:qFormat/>
     <w:uiPriority w:val="10"/>
     <w:rPr>
@@ -4373,7 +5941,7 @@
       <w:lang w:val="vi"/>
     </w:rPr>
   </w:style>
-  <w:style w:type="paragraph" w:styleId="12">
+  <w:style w:type="paragraph" w:styleId="13">
     <w:name w:val="List Paragraph"/>
     <w:basedOn w:val="1"/>
     <w:qFormat/>
@@ -4383,13 +5951,13 @@
       <w:ind w:left="498" w:hanging="138"/>
     </w:pPr>
   </w:style>
-  <w:style w:type="paragraph" w:customStyle="1" w:styleId="13">
+  <w:style w:type="paragraph" w:customStyle="1" w:styleId="14">
     <w:name w:val="Table Paragraph"/>
     <w:basedOn w:val="1"/>
     <w:qFormat/>
     <w:uiPriority w:val="1"/>
   </w:style>
-  <w:style w:type="character" w:customStyle="1" w:styleId="14">
+  <w:style w:type="character" w:customStyle="1" w:styleId="15">
     <w:name w:val="Header Char"/>
     <w:basedOn w:val="3"/>
     <w:link w:val="7"/>
@@ -4400,7 +5968,7 @@
       <w:lang w:val="vi"/>
     </w:rPr>
   </w:style>
-  <w:style w:type="character" w:customStyle="1" w:styleId="15">
+  <w:style w:type="character" w:customStyle="1" w:styleId="16">
     <w:name w:val="Footer Char"/>
     <w:basedOn w:val="3"/>
     <w:link w:val="6"/>

</xml_diff>

<commit_message>
feat: implement document export system with custom plugins and database view for contract management
</commit_message>
<xml_diff>
--- a/backend-app/samples/phu_luc_hop_dong.docx
+++ b/backend-app/samples/phu_luc_hop_dong.docx
@@ -2142,7 +2142,7 @@
           <w:spacing w:val="-4"/>
           <w:lang w:val="en-US"/>
         </w:rPr>
-        <w:t xml:space="preserve">{SoBanManChinhThuc </w:t>
+        <w:t xml:space="preserve">{SoBanManChinhThuc} </w:t>
       </w:r>
       <w:r>
         <w:rPr>
@@ -3100,7 +3100,7 @@
                 <w:sz w:val="24"/>
                 <w:lang w:val="en-US"/>
               </w:rPr>
-              <w:t>{DonGia}</w:t>
+              <w:t>{DonGia}{/MenuTiec}</w:t>
             </w:r>
           </w:p>
         </w:tc>

</xml_diff>

<commit_message>
feat: expand contract and change tracking schemas with new fields and add view for contract appendices
</commit_message>
<xml_diff>
--- a/backend-app/samples/phu_luc_hop_dong.docx
+++ b/backend-app/samples/phu_luc_hop_dong.docx
@@ -2140,7 +2140,7 @@
           <w:spacing w:val="-4"/>
           <w:lang w:val="en-US"/>
         </w:rPr>
-        <w:t xml:space="preserve">{SoBanManChinhThuc} </w:t>
+        <w:t xml:space="preserve">{SoBanChinhThuc} </w:t>
       </w:r>
       <w:r>
         <w:rPr>
@@ -2259,7 +2259,7 @@
           <w:spacing w:val="-5"/>
           <w:lang w:val="en-US"/>
         </w:rPr>
-        <w:t>{SoBanManDuPhong}</w:t>
+        <w:t>{SoBanDuPhong}</w:t>
       </w:r>
       <w:r>
         <w:rPr>

</xml_diff>

<commit_message>
feat: implement Node.js backend server with document generation and template management capabilities
</commit_message>
<xml_diff>
--- a/backend-app/samples/phu_luc_hop_dong.docx
+++ b/backend-app/samples/phu_luc_hop_dong.docx
@@ -1,5 +1,51 @@
 
-<file path=word/document.xml><?xml version="1.0" encoding="utf-8"?>
+<file path=docProps\app.xml><?xml version="1.0" encoding="utf-8"?>
+<Properties xmlns="http://schemas.openxmlformats.org/officeDocument/2006/extended-properties" xmlns:vt="http://schemas.openxmlformats.org/officeDocument/2006/docPropsVTypes">
+  <Template>Normal.dotm</Template>
+  <TotalTime>15</TotalTime>
+  <Pages>1</Pages>
+  <Words>562</Words>
+  <Characters>3207</Characters>
+  <Application>Microsoft Office Word</Application>
+  <DocSecurity>0</DocSecurity>
+  <Lines>26</Lines>
+  <Paragraphs>7</Paragraphs>
+  <ScaleCrop>false</ScaleCrop>
+  <Company/>
+  <LinksUpToDate>false</LinksUpToDate>
+  <CharactersWithSpaces>3762</CharactersWithSpaces>
+  <SharedDoc>false</SharedDoc>
+  <HyperlinksChanged>false</HyperlinksChanged>
+  <AppVersion>16.0000</AppVersion>
+</Properties>
+</file>
+
+<file path=docProps\core.xml><?xml version="1.0" encoding="utf-8"?>
+<cp:coreProperties xmlns:cp="http://schemas.openxmlformats.org/package/2006/metadata/core-properties" xmlns:dc="http://purl.org/dc/elements/1.1/" xmlns:dcterms="http://purl.org/dc/terms/" xmlns:dcmitype="http://purl.org/dc/dcmitype/" xmlns:xsi="http://www.w3.org/2001/XMLSchema-instance">
+  <dc:creator>ACER</dc:creator>
+  <cp:lastModifiedBy>Tai Nguyen</cp:lastModifiedBy>
+  <cp:revision>128</cp:revision>
+  <cp:lastPrinted>2026-03-24T11:44:00Z</cp:lastPrinted>
+  <dcterms:created xsi:type="dcterms:W3CDTF">2025-08-16T08:48:00Z</dcterms:created>
+  <dcterms:modified xsi:type="dcterms:W3CDTF">2026-06-26T04:07:00Z</dcterms:modified>
+</cp:coreProperties>
+</file>
+
+<file path=docProps\custom.xml><?xml version="1.0" encoding="utf-8"?>
+<Properties xmlns="http://schemas.openxmlformats.org/officeDocument/2006/custom-properties" xmlns:vt="http://schemas.openxmlformats.org/officeDocument/2006/docPropsVTypes">
+  <property fmtid="{D5CDD505-2E9C-101B-9397-08002B2CF9AE}" pid="2" name="KSOTemplateDocerSaveRecord">
+    <vt:lpwstr>eyJoZGlkIjoiYTJmYzZiNzA0MjJkZjA3YmRmYTQ1N2VlZWVlZDk3MzgifQ==</vt:lpwstr>
+  </property>
+  <property fmtid="{D5CDD505-2E9C-101B-9397-08002B2CF9AE}" pid="3" name="KSOProductBuildVer">
+    <vt:lpwstr>1033-12.1.0.26880</vt:lpwstr>
+  </property>
+  <property fmtid="{D5CDD505-2E9C-101B-9397-08002B2CF9AE}" pid="4" name="ICV">
+    <vt:lpwstr>E3BB9D2E3B4548B3B710C02F0CDE9CA1_12</vt:lpwstr>
+  </property>
+</Properties>
+</file>
+
+<file path=word\document.xml><?xml version="1.0" encoding="utf-8"?>
 <w:document xmlns:wpc="http://schemas.microsoft.com/office/word/2010/wordprocessingCanvas" xmlns:cx="http://schemas.microsoft.com/office/drawing/2014/chartex" xmlns:cx1="http://schemas.microsoft.com/office/drawing/2015/9/8/chartex" xmlns:cx2="http://schemas.microsoft.com/office/drawing/2015/10/21/chartex" xmlns:cx3="http://schemas.microsoft.com/office/drawing/2016/5/9/chartex" xmlns:cx4="http://schemas.microsoft.com/office/drawing/2016/5/10/chartex" xmlns:cx5="http://schemas.microsoft.com/office/drawing/2016/5/11/chartex" xmlns:cx6="http://schemas.microsoft.com/office/drawing/2016/5/12/chartex" xmlns:cx7="http://schemas.microsoft.com/office/drawing/2016/5/13/chartex" xmlns:cx8="http://schemas.microsoft.com/office/drawing/2016/5/14/chartex" xmlns:mc="http://schemas.openxmlformats.org/markup-compatibility/2006" xmlns:aink="http://schemas.microsoft.com/office/drawing/2016/ink" xmlns:am3d="http://schemas.microsoft.com/office/drawing/2017/model3d" xmlns:o="urn:schemas-microsoft-com:office:office" xmlns:oel="http://schemas.microsoft.com/office/2019/extlst" xmlns:r="http://schemas.openxmlformats.org/officeDocument/2006/relationships" xmlns:m="http://schemas.openxmlformats.org/officeDocument/2006/math" xmlns:v="urn:schemas-microsoft-com:vml" xmlns:wp14="http://schemas.microsoft.com/office/word/2010/wordprocessingDrawing" xmlns:wp="http://schemas.openxmlformats.org/drawingml/2006/wordprocessingDrawing" xmlns:w10="urn:schemas-microsoft-com:office:word" xmlns:w="http://schemas.openxmlformats.org/wordprocessingml/2006/main" xmlns:w14="http://schemas.microsoft.com/office/word/2010/wordml" xmlns:w15="http://schemas.microsoft.com/office/word/2012/wordml" xmlns:w16cex="http://schemas.microsoft.com/office/word/2018/wordml/cex" xmlns:w16cid="http://schemas.microsoft.com/office/word/2016/wordml/cid" xmlns:w16="http://schemas.microsoft.com/office/word/2018/wordml" xmlns:w16du="http://schemas.microsoft.com/office/word/2023/wordml/word16du" xmlns:w16sdtdh="http://schemas.microsoft.com/office/word/2020/wordml/sdtdatahash" xmlns:w16sdtfl="http://schemas.microsoft.com/office/word/2024/wordml/sdtformatlock" xmlns:w16se="http://schemas.microsoft.com/office/word/2015/wordml/symex" xmlns:wpg="http://schemas.microsoft.com/office/word/2010/wordprocessingGroup" xmlns:wpi="http://schemas.microsoft.com/office/word/2010/wordprocessingInk" xmlns:wne="http://schemas.microsoft.com/office/word/2006/wordml" xmlns:wps="http://schemas.microsoft.com/office/word/2010/wordprocessingShape" mc:Ignorable="w14 w15 w16se w16cid w16 w16cex w16sdtdh w16sdtfl w16du wp14">
   <w:body>
     <w:p>
@@ -3813,6 +3859,11 @@
           <w:sz w:val="24"/>
         </w:rPr>
         <w:t>{#DichVuTinhPhiPhuLuc}- {TenDichVu}: {DonGia} VNĐ ({GhiChu})</w:t>
+      </w:r>
+    </w:p>
+    <w:p>
+      <w:r>
+        <w:t xml:space="preserve">{/DichVuTinhPhiPhuLuc}</w:t>
       </w:r>
     </w:p>
     <w:p>
@@ -7352,7 +7403,7 @@
 </w:document>
 </file>
 
-<file path=word/endnotes.xml><?xml version="1.0" encoding="utf-8"?>
+<file path=word\endnotes.xml><?xml version="1.0" encoding="utf-8"?>
 <w:endnotes xmlns:wpc="http://schemas.microsoft.com/office/word/2010/wordprocessingCanvas" xmlns:cx="http://schemas.microsoft.com/office/drawing/2014/chartex" xmlns:cx1="http://schemas.microsoft.com/office/drawing/2015/9/8/chartex" xmlns:cx2="http://schemas.microsoft.com/office/drawing/2015/10/21/chartex" xmlns:cx3="http://schemas.microsoft.com/office/drawing/2016/5/9/chartex" xmlns:cx4="http://schemas.microsoft.com/office/drawing/2016/5/10/chartex" xmlns:cx5="http://schemas.microsoft.com/office/drawing/2016/5/11/chartex" xmlns:cx6="http://schemas.microsoft.com/office/drawing/2016/5/12/chartex" xmlns:cx7="http://schemas.microsoft.com/office/drawing/2016/5/13/chartex" xmlns:cx8="http://schemas.microsoft.com/office/drawing/2016/5/14/chartex" xmlns:mc="http://schemas.openxmlformats.org/markup-compatibility/2006" xmlns:aink="http://schemas.microsoft.com/office/drawing/2016/ink" xmlns:am3d="http://schemas.microsoft.com/office/drawing/2017/model3d" xmlns:o="urn:schemas-microsoft-com:office:office" xmlns:oel="http://schemas.microsoft.com/office/2019/extlst" xmlns:r="http://schemas.openxmlformats.org/officeDocument/2006/relationships" xmlns:m="http://schemas.openxmlformats.org/officeDocument/2006/math" xmlns:v="urn:schemas-microsoft-com:vml" xmlns:wp14="http://schemas.microsoft.com/office/word/2010/wordprocessingDrawing" xmlns:wp="http://schemas.openxmlformats.org/drawingml/2006/wordprocessingDrawing" xmlns:w10="urn:schemas-microsoft-com:office:word" xmlns:w="http://schemas.openxmlformats.org/wordprocessingml/2006/main" xmlns:w14="http://schemas.microsoft.com/office/word/2010/wordml" xmlns:w15="http://schemas.microsoft.com/office/word/2012/wordml" xmlns:w16cex="http://schemas.microsoft.com/office/word/2018/wordml/cex" xmlns:w16cid="http://schemas.microsoft.com/office/word/2016/wordml/cid" xmlns:w16="http://schemas.microsoft.com/office/word/2018/wordml" xmlns:w16du="http://schemas.microsoft.com/office/word/2023/wordml/word16du" xmlns:w16sdtdh="http://schemas.microsoft.com/office/word/2020/wordml/sdtdatahash" xmlns:w16sdtfl="http://schemas.microsoft.com/office/word/2024/wordml/sdtformatlock" xmlns:w16se="http://schemas.microsoft.com/office/word/2015/wordml/symex" xmlns:wpg="http://schemas.microsoft.com/office/word/2010/wordprocessingGroup" xmlns:wpi="http://schemas.microsoft.com/office/word/2010/wordprocessingInk" xmlns:wne="http://schemas.microsoft.com/office/word/2006/wordml" xmlns:wps="http://schemas.microsoft.com/office/word/2010/wordprocessingShape" mc:Ignorable="w14 w15 w16se w16cid w16 w16cex w16sdtdh w16sdtfl w16du wp14">
   <w:endnote w:type="separator" w:id="-1">
     <w:p>
@@ -7371,7 +7422,84 @@
 </w:endnotes>
 </file>
 
-<file path=word/footer1.xml><?xml version="1.0" encoding="utf-8"?>
+<file path=word\fontTable.xml><?xml version="1.0" encoding="utf-8"?>
+<w:fonts xmlns:mc="http://schemas.openxmlformats.org/markup-compatibility/2006" xmlns:r="http://schemas.openxmlformats.org/officeDocument/2006/relationships" xmlns:w="http://schemas.openxmlformats.org/wordprocessingml/2006/main" xmlns:w14="http://schemas.microsoft.com/office/word/2010/wordml" xmlns:w15="http://schemas.microsoft.com/office/word/2012/wordml" xmlns:w16cex="http://schemas.microsoft.com/office/word/2018/wordml/cex" xmlns:w16cid="http://schemas.microsoft.com/office/word/2016/wordml/cid" xmlns:w16="http://schemas.microsoft.com/office/word/2018/wordml" xmlns:w16du="http://schemas.microsoft.com/office/word/2023/wordml/word16du" xmlns:w16sdtdh="http://schemas.microsoft.com/office/word/2020/wordml/sdtdatahash" xmlns:w16sdtfl="http://schemas.microsoft.com/office/word/2024/wordml/sdtformatlock" xmlns:w16se="http://schemas.microsoft.com/office/word/2015/wordml/symex" mc:Ignorable="w14 w15 w16se w16cid w16 w16cex w16sdtdh w16sdtfl w16du">
+  <w:font w:name="Bell MT">
+    <w:panose1 w:val="02020503060305020303"/>
+    <w:charset w:val="00"/>
+    <w:family w:val="roman"/>
+    <w:pitch w:val="variable"/>
+    <w:sig w:usb0="00000003" w:usb1="00000000" w:usb2="00000000" w:usb3="00000000" w:csb0="00000001" w:csb1="00000000"/>
+  </w:font>
+  <w:font w:name="Times New Roman">
+    <w:panose1 w:val="02020603050405020304"/>
+    <w:charset w:val="00"/>
+    <w:family w:val="roman"/>
+    <w:pitch w:val="variable"/>
+    <w:sig w:usb0="E0002EFF" w:usb1="C000785B" w:usb2="00000009" w:usb3="00000000" w:csb0="000001FF" w:csb1="00000000"/>
+  </w:font>
+  <w:font w:name="Symbol">
+    <w:panose1 w:val="05050102010706020507"/>
+    <w:charset w:val="02"/>
+    <w:family w:val="roman"/>
+    <w:pitch w:val="variable"/>
+    <w:sig w:usb0="00000000" w:usb1="10000000" w:usb2="00000000" w:usb3="00000000" w:csb0="80000000" w:csb1="00000000"/>
+  </w:font>
+  <w:font w:name="Courier New">
+    <w:panose1 w:val="02070309020205020404"/>
+    <w:charset w:val="00"/>
+    <w:family w:val="modern"/>
+    <w:pitch w:val="fixed"/>
+    <w:sig w:usb0="E0002EFF" w:usb1="C0007843" w:usb2="00000009" w:usb3="00000000" w:csb0="000001FF" w:csb1="00000000"/>
+  </w:font>
+  <w:font w:name="Wingdings">
+    <w:panose1 w:val="05000000000000000000"/>
+    <w:charset w:val="02"/>
+    <w:family w:val="auto"/>
+    <w:pitch w:val="variable"/>
+    <w:sig w:usb0="00000000" w:usb1="10000000" w:usb2="00000000" w:usb3="00000000" w:csb0="80000000" w:csb1="00000000"/>
+  </w:font>
+  <w:font w:name="SimSun">
+    <w:altName w:val="宋体"/>
+    <w:panose1 w:val="02010600030101010101"/>
+    <w:charset w:val="86"/>
+    <w:family w:val="auto"/>
+    <w:pitch w:val="variable"/>
+    <w:sig w:usb0="00000203" w:usb1="288F0000" w:usb2="00000016" w:usb3="00000000" w:csb0="00040001" w:csb1="00000000"/>
+  </w:font>
+  <w:font w:name="DengXian Light">
+    <w:altName w:val="等线 Light"/>
+    <w:charset w:val="86"/>
+    <w:family w:val="auto"/>
+    <w:pitch w:val="variable"/>
+    <w:sig w:usb0="A00002BF" w:usb1="38CF7CFA" w:usb2="00000016" w:usb3="00000000" w:csb0="0004000F" w:csb1="00000000"/>
+  </w:font>
+  <w:font w:name="Calibri Light">
+    <w:panose1 w:val="020F0302020204030204"/>
+    <w:charset w:val="00"/>
+    <w:family w:val="swiss"/>
+    <w:pitch w:val="variable"/>
+    <w:sig w:usb0="E4002EFF" w:usb1="C200247B" w:usb2="00000009" w:usb3="00000000" w:csb0="000001FF" w:csb1="00000000"/>
+  </w:font>
+  <w:font w:name="DengXian">
+    <w:altName w:val="等线"/>
+    <w:panose1 w:val="02010600030101010101"/>
+    <w:charset w:val="86"/>
+    <w:family w:val="auto"/>
+    <w:pitch w:val="variable"/>
+    <w:sig w:usb0="A00002BF" w:usb1="38CF7CFA" w:usb2="00000016" w:usb3="00000000" w:csb0="0004000F" w:csb1="00000000"/>
+  </w:font>
+  <w:font w:name="Calibri">
+    <w:panose1 w:val="020F0502020204030204"/>
+    <w:charset w:val="00"/>
+    <w:family w:val="swiss"/>
+    <w:pitch w:val="variable"/>
+    <w:sig w:usb0="E4002EFF" w:usb1="C200247B" w:usb2="00000009" w:usb3="00000000" w:csb0="000001FF" w:csb1="00000000"/>
+  </w:font>
+</w:fonts>
+</file>
+
+<file path=word\footer1.xml><?xml version="1.0" encoding="utf-8"?>
 <w:ftr xmlns:wpc="http://schemas.microsoft.com/office/word/2010/wordprocessingCanvas" xmlns:cx="http://schemas.microsoft.com/office/drawing/2014/chartex" xmlns:cx1="http://schemas.microsoft.com/office/drawing/2015/9/8/chartex" xmlns:cx2="http://schemas.microsoft.com/office/drawing/2015/10/21/chartex" xmlns:cx3="http://schemas.microsoft.com/office/drawing/2016/5/9/chartex" xmlns:cx4="http://schemas.microsoft.com/office/drawing/2016/5/10/chartex" xmlns:cx5="http://schemas.microsoft.com/office/drawing/2016/5/11/chartex" xmlns:cx6="http://schemas.microsoft.com/office/drawing/2016/5/12/chartex" xmlns:cx7="http://schemas.microsoft.com/office/drawing/2016/5/13/chartex" xmlns:cx8="http://schemas.microsoft.com/office/drawing/2016/5/14/chartex" xmlns:mc="http://schemas.openxmlformats.org/markup-compatibility/2006" xmlns:aink="http://schemas.microsoft.com/office/drawing/2016/ink" xmlns:am3d="http://schemas.microsoft.com/office/drawing/2017/model3d" xmlns:o="urn:schemas-microsoft-com:office:office" xmlns:oel="http://schemas.microsoft.com/office/2019/extlst" xmlns:r="http://schemas.openxmlformats.org/officeDocument/2006/relationships" xmlns:m="http://schemas.openxmlformats.org/officeDocument/2006/math" xmlns:v="urn:schemas-microsoft-com:vml" xmlns:wp14="http://schemas.microsoft.com/office/word/2010/wordprocessingDrawing" xmlns:wp="http://schemas.openxmlformats.org/drawingml/2006/wordprocessingDrawing" xmlns:w10="urn:schemas-microsoft-com:office:word" xmlns:w="http://schemas.openxmlformats.org/wordprocessingml/2006/main" xmlns:w14="http://schemas.microsoft.com/office/word/2010/wordml" xmlns:w15="http://schemas.microsoft.com/office/word/2012/wordml" xmlns:w16cex="http://schemas.microsoft.com/office/word/2018/wordml/cex" xmlns:w16cid="http://schemas.microsoft.com/office/word/2016/wordml/cid" xmlns:w16="http://schemas.microsoft.com/office/word/2018/wordml" xmlns:w16du="http://schemas.microsoft.com/office/word/2023/wordml/word16du" xmlns:w16sdtdh="http://schemas.microsoft.com/office/word/2020/wordml/sdtdatahash" xmlns:w16sdtfl="http://schemas.microsoft.com/office/word/2024/wordml/sdtformatlock" xmlns:w16se="http://schemas.microsoft.com/office/word/2015/wordml/symex" xmlns:wpg="http://schemas.microsoft.com/office/word/2010/wordprocessingGroup" xmlns:wpi="http://schemas.microsoft.com/office/word/2010/wordprocessingInk" xmlns:wne="http://schemas.microsoft.com/office/word/2006/wordml" xmlns:wps="http://schemas.microsoft.com/office/word/2010/wordprocessingShape" mc:Ignorable="w14 w15 w16se w16cid w16 w16cex w16sdtdh w16sdtfl w16du wp14">
   <w:p>
     <w:pPr>
@@ -7466,7 +7594,7 @@
 </w:ftr>
 </file>
 
-<file path=word/footnotes.xml><?xml version="1.0" encoding="utf-8"?>
+<file path=word\footnotes.xml><?xml version="1.0" encoding="utf-8"?>
 <w:footnotes xmlns:wpc="http://schemas.microsoft.com/office/word/2010/wordprocessingCanvas" xmlns:cx="http://schemas.microsoft.com/office/drawing/2014/chartex" xmlns:cx1="http://schemas.microsoft.com/office/drawing/2015/9/8/chartex" xmlns:cx2="http://schemas.microsoft.com/office/drawing/2015/10/21/chartex" xmlns:cx3="http://schemas.microsoft.com/office/drawing/2016/5/9/chartex" xmlns:cx4="http://schemas.microsoft.com/office/drawing/2016/5/10/chartex" xmlns:cx5="http://schemas.microsoft.com/office/drawing/2016/5/11/chartex" xmlns:cx6="http://schemas.microsoft.com/office/drawing/2016/5/12/chartex" xmlns:cx7="http://schemas.microsoft.com/office/drawing/2016/5/13/chartex" xmlns:cx8="http://schemas.microsoft.com/office/drawing/2016/5/14/chartex" xmlns:mc="http://schemas.openxmlformats.org/markup-compatibility/2006" xmlns:aink="http://schemas.microsoft.com/office/drawing/2016/ink" xmlns:am3d="http://schemas.microsoft.com/office/drawing/2017/model3d" xmlns:o="urn:schemas-microsoft-com:office:office" xmlns:oel="http://schemas.microsoft.com/office/2019/extlst" xmlns:r="http://schemas.openxmlformats.org/officeDocument/2006/relationships" xmlns:m="http://schemas.openxmlformats.org/officeDocument/2006/math" xmlns:v="urn:schemas-microsoft-com:vml" xmlns:wp14="http://schemas.microsoft.com/office/word/2010/wordprocessingDrawing" xmlns:wp="http://schemas.openxmlformats.org/drawingml/2006/wordprocessingDrawing" xmlns:w10="urn:schemas-microsoft-com:office:word" xmlns:w="http://schemas.openxmlformats.org/wordprocessingml/2006/main" xmlns:w14="http://schemas.microsoft.com/office/word/2010/wordml" xmlns:w15="http://schemas.microsoft.com/office/word/2012/wordml" xmlns:w16cex="http://schemas.microsoft.com/office/word/2018/wordml/cex" xmlns:w16cid="http://schemas.microsoft.com/office/word/2016/wordml/cid" xmlns:w16="http://schemas.microsoft.com/office/word/2018/wordml" xmlns:w16du="http://schemas.microsoft.com/office/word/2023/wordml/word16du" xmlns:w16sdtdh="http://schemas.microsoft.com/office/word/2020/wordml/sdtdatahash" xmlns:w16sdtfl="http://schemas.microsoft.com/office/word/2024/wordml/sdtformatlock" xmlns:w16se="http://schemas.microsoft.com/office/word/2015/wordml/symex" xmlns:wpg="http://schemas.microsoft.com/office/word/2010/wordprocessingGroup" xmlns:wpi="http://schemas.microsoft.com/office/word/2010/wordprocessingInk" xmlns:wne="http://schemas.microsoft.com/office/word/2006/wordml" xmlns:wps="http://schemas.microsoft.com/office/word/2010/wordprocessingShape" mc:Ignorable="w14 w15 w16se w16cid w16 w16cex w16sdtdh w16sdtfl w16du wp14">
   <w:footnote w:type="separator" w:id="-1">
     <w:p>
@@ -7485,7 +7613,7 @@
 </w:footnotes>
 </file>
 
-<file path=word/numbering.xml><?xml version="1.0" encoding="utf-8"?>
+<file path=word\numbering.xml><?xml version="1.0" encoding="utf-8"?>
 <w:numbering xmlns:wpc="http://schemas.microsoft.com/office/word/2010/wordprocessingCanvas" xmlns:cx="http://schemas.microsoft.com/office/drawing/2014/chartex" xmlns:cx1="http://schemas.microsoft.com/office/drawing/2015/9/8/chartex" xmlns:cx2="http://schemas.microsoft.com/office/drawing/2015/10/21/chartex" xmlns:cx3="http://schemas.microsoft.com/office/drawing/2016/5/9/chartex" xmlns:cx4="http://schemas.microsoft.com/office/drawing/2016/5/10/chartex" xmlns:cx5="http://schemas.microsoft.com/office/drawing/2016/5/11/chartex" xmlns:cx6="http://schemas.microsoft.com/office/drawing/2016/5/12/chartex" xmlns:cx7="http://schemas.microsoft.com/office/drawing/2016/5/13/chartex" xmlns:cx8="http://schemas.microsoft.com/office/drawing/2016/5/14/chartex" xmlns:mc="http://schemas.openxmlformats.org/markup-compatibility/2006" xmlns:aink="http://schemas.microsoft.com/office/drawing/2016/ink" xmlns:am3d="http://schemas.microsoft.com/office/drawing/2017/model3d" xmlns:o="urn:schemas-microsoft-com:office:office" xmlns:oel="http://schemas.microsoft.com/office/2019/extlst" xmlns:r="http://schemas.openxmlformats.org/officeDocument/2006/relationships" xmlns:m="http://schemas.openxmlformats.org/officeDocument/2006/math" xmlns:v="urn:schemas-microsoft-com:vml" xmlns:wp14="http://schemas.microsoft.com/office/word/2010/wordprocessingDrawing" xmlns:wp="http://schemas.openxmlformats.org/drawingml/2006/wordprocessingDrawing" xmlns:w10="urn:schemas-microsoft-com:office:word" xmlns:w="http://schemas.openxmlformats.org/wordprocessingml/2006/main" xmlns:w14="http://schemas.microsoft.com/office/word/2010/wordml" xmlns:w15="http://schemas.microsoft.com/office/word/2012/wordml" xmlns:w16cex="http://schemas.microsoft.com/office/word/2018/wordml/cex" xmlns:w16cid="http://schemas.microsoft.com/office/word/2016/wordml/cid" xmlns:w16="http://schemas.microsoft.com/office/word/2018/wordml" xmlns:w16du="http://schemas.microsoft.com/office/word/2023/wordml/word16du" xmlns:w16sdtdh="http://schemas.microsoft.com/office/word/2020/wordml/sdtdatahash" xmlns:w16sdtfl="http://schemas.microsoft.com/office/word/2024/wordml/sdtformatlock" xmlns:w16se="http://schemas.microsoft.com/office/word/2015/wordml/symex" xmlns:wpg="http://schemas.microsoft.com/office/word/2010/wordprocessingGroup" xmlns:wpi="http://schemas.microsoft.com/office/word/2010/wordprocessingInk" xmlns:wne="http://schemas.microsoft.com/office/word/2006/wordml" xmlns:wps="http://schemas.microsoft.com/office/word/2010/wordprocessingShape" mc:Ignorable="w14 w15 w16se w16cid w16 w16cex w16sdtdh w16sdtfl w16du wp14">
   <w:abstractNum w:abstractNumId="0" w15:restartNumberingAfterBreak="0">
     <w:nsid w:val="16590D4D"/>
@@ -8250,7 +8378,281 @@
 </w:numbering>
 </file>
 
-<file path=word/styles.xml><?xml version="1.0" encoding="utf-8"?>
+<file path=word\settings.xml><?xml version="1.0" encoding="utf-8"?>
+<w:settings xmlns:mc="http://schemas.openxmlformats.org/markup-compatibility/2006" xmlns:o="urn:schemas-microsoft-com:office:office" xmlns:r="http://schemas.openxmlformats.org/officeDocument/2006/relationships" xmlns:m="http://schemas.openxmlformats.org/officeDocument/2006/math" xmlns:v="urn:schemas-microsoft-com:vml" xmlns:w10="urn:schemas-microsoft-com:office:word" xmlns:w="http://schemas.openxmlformats.org/wordprocessingml/2006/main" xmlns:w14="http://schemas.microsoft.com/office/word/2010/wordml" xmlns:w15="http://schemas.microsoft.com/office/word/2012/wordml" xmlns:w16cex="http://schemas.microsoft.com/office/word/2018/wordml/cex" xmlns:w16cid="http://schemas.microsoft.com/office/word/2016/wordml/cid" xmlns:w16="http://schemas.microsoft.com/office/word/2018/wordml" xmlns:w16du="http://schemas.microsoft.com/office/word/2023/wordml/word16du" xmlns:w16sdtdh="http://schemas.microsoft.com/office/word/2020/wordml/sdtdatahash" xmlns:w16sdtfl="http://schemas.microsoft.com/office/word/2024/wordml/sdtformatlock" xmlns:w16se="http://schemas.microsoft.com/office/word/2015/wordml/symex" xmlns:sl="http://schemas.openxmlformats.org/schemaLibrary/2006/main" mc:Ignorable="w14 w15 w16se w16cid w16 w16cex w16sdtdh w16sdtfl w16du">
+  <w:view w:val="web"/>
+  <w:zoom w:percent="130"/>
+  <w:proofState w:spelling="clean" w:grammar="clean"/>
+  <w:defaultTabStop w:val="720"/>
+  <w:noPunctuationKerning/>
+  <w:characterSpacingControl w:val="doNotCompress"/>
+  <w:footnotePr>
+    <w:footnote w:id="-1"/>
+    <w:footnote w:id="0"/>
+  </w:footnotePr>
+  <w:endnotePr>
+    <w:endnote w:id="-1"/>
+    <w:endnote w:id="0"/>
+  </w:endnotePr>
+  <w:compat>
+    <w:doNotExpandShiftReturn/>
+    <w:useFELayout/>
+    <w:compatSetting w:name="compatibilityMode" w:uri="http://schemas.microsoft.com/office/word" w:val="15"/>
+    <w:compatSetting w:name="overrideTableStyleFontSizeAndJustification" w:uri="http://schemas.microsoft.com/office/word" w:val="1"/>
+    <w:compatSetting w:name="enableOpenTypeFeatures" w:uri="http://schemas.microsoft.com/office/word" w:val="1"/>
+    <w:compatSetting w:name="doNotFlipMirrorIndents" w:uri="http://schemas.microsoft.com/office/word" w:val="1"/>
+    <w:compatSetting w:name="differentiateMultirowTableHeaders" w:uri="http://schemas.microsoft.com/office/word" w:val="1"/>
+    <w:compatSetting w:name="useWord2013TrackBottomHyphenation" w:uri="http://schemas.microsoft.com/office/word" w:val="1"/>
+  </w:compat>
+  <w:rsids>
+    <w:rsidRoot w:val="00172A27"/>
+    <w:rsid w:val="000146B8"/>
+    <w:rsid w:val="00045726"/>
+    <w:rsid w:val="0009068A"/>
+    <w:rsid w:val="0009341D"/>
+    <w:rsid w:val="00096DD8"/>
+    <w:rsid w:val="000D4B7E"/>
+    <w:rsid w:val="000E3D10"/>
+    <w:rsid w:val="00113829"/>
+    <w:rsid w:val="00172A27"/>
+    <w:rsid w:val="00197DD0"/>
+    <w:rsid w:val="001E06C5"/>
+    <w:rsid w:val="0020555C"/>
+    <w:rsid w:val="0021306E"/>
+    <w:rsid w:val="00222F80"/>
+    <w:rsid w:val="00241F8C"/>
+    <w:rsid w:val="0024285A"/>
+    <w:rsid w:val="002454E3"/>
+    <w:rsid w:val="00285A70"/>
+    <w:rsid w:val="00286867"/>
+    <w:rsid w:val="002D2533"/>
+    <w:rsid w:val="002E230A"/>
+    <w:rsid w:val="002F08CB"/>
+    <w:rsid w:val="00330C1D"/>
+    <w:rsid w:val="0033300E"/>
+    <w:rsid w:val="00350C3C"/>
+    <w:rsid w:val="003566ED"/>
+    <w:rsid w:val="0039264B"/>
+    <w:rsid w:val="003930C3"/>
+    <w:rsid w:val="003A06C5"/>
+    <w:rsid w:val="003D7F21"/>
+    <w:rsid w:val="003E59E3"/>
+    <w:rsid w:val="003E781C"/>
+    <w:rsid w:val="003F3EEE"/>
+    <w:rsid w:val="003F4FB8"/>
+    <w:rsid w:val="003F5E1F"/>
+    <w:rsid w:val="004001BB"/>
+    <w:rsid w:val="00412B45"/>
+    <w:rsid w:val="00415CE6"/>
+    <w:rsid w:val="00435236"/>
+    <w:rsid w:val="00441519"/>
+    <w:rsid w:val="00463214"/>
+    <w:rsid w:val="00487221"/>
+    <w:rsid w:val="00496E37"/>
+    <w:rsid w:val="004C11C9"/>
+    <w:rsid w:val="004F7D46"/>
+    <w:rsid w:val="00500CD8"/>
+    <w:rsid w:val="00547831"/>
+    <w:rsid w:val="00565CFA"/>
+    <w:rsid w:val="00584E14"/>
+    <w:rsid w:val="00594A3E"/>
+    <w:rsid w:val="005B7585"/>
+    <w:rsid w:val="005F5135"/>
+    <w:rsid w:val="00616FDF"/>
+    <w:rsid w:val="00617EE3"/>
+    <w:rsid w:val="00625A50"/>
+    <w:rsid w:val="0067577E"/>
+    <w:rsid w:val="00695A96"/>
+    <w:rsid w:val="006C7660"/>
+    <w:rsid w:val="006D7026"/>
+    <w:rsid w:val="006F5643"/>
+    <w:rsid w:val="007061A1"/>
+    <w:rsid w:val="00760997"/>
+    <w:rsid w:val="0076572C"/>
+    <w:rsid w:val="00770173"/>
+    <w:rsid w:val="00783C08"/>
+    <w:rsid w:val="007B7F2E"/>
+    <w:rsid w:val="007C3468"/>
+    <w:rsid w:val="007C6C1B"/>
+    <w:rsid w:val="007D6FD5"/>
+    <w:rsid w:val="007F40D2"/>
+    <w:rsid w:val="007F74E4"/>
+    <w:rsid w:val="0080342A"/>
+    <w:rsid w:val="00806914"/>
+    <w:rsid w:val="00815175"/>
+    <w:rsid w:val="008279BF"/>
+    <w:rsid w:val="00851683"/>
+    <w:rsid w:val="008B03AE"/>
+    <w:rsid w:val="008E3CE2"/>
+    <w:rsid w:val="008F03A0"/>
+    <w:rsid w:val="008F18A0"/>
+    <w:rsid w:val="009178CB"/>
+    <w:rsid w:val="00923E9F"/>
+    <w:rsid w:val="00924AAD"/>
+    <w:rsid w:val="00926DBE"/>
+    <w:rsid w:val="009340E1"/>
+    <w:rsid w:val="009B193A"/>
+    <w:rsid w:val="009C673F"/>
+    <w:rsid w:val="00A24B27"/>
+    <w:rsid w:val="00A37C86"/>
+    <w:rsid w:val="00A4437A"/>
+    <w:rsid w:val="00A44A8C"/>
+    <w:rsid w:val="00A6434B"/>
+    <w:rsid w:val="00A77B63"/>
+    <w:rsid w:val="00A80452"/>
+    <w:rsid w:val="00AB1017"/>
+    <w:rsid w:val="00AF66F3"/>
+    <w:rsid w:val="00B32142"/>
+    <w:rsid w:val="00B4186B"/>
+    <w:rsid w:val="00B70364"/>
+    <w:rsid w:val="00B86A63"/>
+    <w:rsid w:val="00BB0E11"/>
+    <w:rsid w:val="00BC7945"/>
+    <w:rsid w:val="00C14EDD"/>
+    <w:rsid w:val="00C17FC9"/>
+    <w:rsid w:val="00C42B31"/>
+    <w:rsid w:val="00C53A5B"/>
+    <w:rsid w:val="00C60C93"/>
+    <w:rsid w:val="00C75210"/>
+    <w:rsid w:val="00C76FCD"/>
+    <w:rsid w:val="00CB478B"/>
+    <w:rsid w:val="00D47245"/>
+    <w:rsid w:val="00D55337"/>
+    <w:rsid w:val="00D87BEB"/>
+    <w:rsid w:val="00DB731E"/>
+    <w:rsid w:val="00DC592A"/>
+    <w:rsid w:val="00E13562"/>
+    <w:rsid w:val="00E25592"/>
+    <w:rsid w:val="00E812F0"/>
+    <w:rsid w:val="00E846E7"/>
+    <w:rsid w:val="00E849E9"/>
+    <w:rsid w:val="00E9042C"/>
+    <w:rsid w:val="00EA6D30"/>
+    <w:rsid w:val="00EC3004"/>
+    <w:rsid w:val="00EC4B55"/>
+    <w:rsid w:val="00EC770E"/>
+    <w:rsid w:val="00EE7447"/>
+    <w:rsid w:val="00F301FB"/>
+    <w:rsid w:val="00F647C8"/>
+    <w:rsid w:val="00F9048E"/>
+    <w:rsid w:val="00F91589"/>
+    <w:rsid w:val="00FB57E2"/>
+    <w:rsid w:val="00FC5643"/>
+    <w:rsid w:val="00FC7A00"/>
+    <w:rsid w:val="00FE5E41"/>
+    <w:rsid w:val="01A45240"/>
+    <w:rsid w:val="01C94053"/>
+    <w:rsid w:val="01FA0599"/>
+    <w:rsid w:val="04860FD3"/>
+    <w:rsid w:val="04A87776"/>
+    <w:rsid w:val="069F33E9"/>
+    <w:rsid w:val="0BD8436C"/>
+    <w:rsid w:val="0C116DA7"/>
+    <w:rsid w:val="0CF31BCF"/>
+    <w:rsid w:val="0F993AB0"/>
+    <w:rsid w:val="12400C2B"/>
+    <w:rsid w:val="125B4710"/>
+    <w:rsid w:val="15270F29"/>
+    <w:rsid w:val="156D0833"/>
+    <w:rsid w:val="15891D69"/>
+    <w:rsid w:val="18E4317F"/>
+    <w:rsid w:val="19201045"/>
+    <w:rsid w:val="1B1C7DA8"/>
+    <w:rsid w:val="1EA13FCF"/>
+    <w:rsid w:val="20E33CD6"/>
+    <w:rsid w:val="20EE63B6"/>
+    <w:rsid w:val="227E5224"/>
+    <w:rsid w:val="23A4643B"/>
+    <w:rsid w:val="23CF178A"/>
+    <w:rsid w:val="2677168A"/>
+    <w:rsid w:val="293C5BA8"/>
+    <w:rsid w:val="2A3031EC"/>
+    <w:rsid w:val="2BD94BFC"/>
+    <w:rsid w:val="2CB3483F"/>
+    <w:rsid w:val="2E1C2976"/>
+    <w:rsid w:val="2EAA494B"/>
+    <w:rsid w:val="2F2C044A"/>
+    <w:rsid w:val="2F604549"/>
+    <w:rsid w:val="2FB02D10"/>
+    <w:rsid w:val="31D15247"/>
+    <w:rsid w:val="33851415"/>
+    <w:rsid w:val="339D6ABC"/>
+    <w:rsid w:val="35284AC8"/>
+    <w:rsid w:val="3550287E"/>
+    <w:rsid w:val="35AB71BA"/>
+    <w:rsid w:val="38F73D85"/>
+    <w:rsid w:val="3B2E5BB3"/>
+    <w:rsid w:val="3CCF1553"/>
+    <w:rsid w:val="3F1C6F47"/>
+    <w:rsid w:val="43B33B1D"/>
+    <w:rsid w:val="466054DD"/>
+    <w:rsid w:val="46AC2EC2"/>
+    <w:rsid w:val="46D803EA"/>
+    <w:rsid w:val="4B14423A"/>
+    <w:rsid w:val="4B922AEA"/>
+    <w:rsid w:val="4B9C5418"/>
+    <w:rsid w:val="4C663913"/>
+    <w:rsid w:val="4D244EB8"/>
+    <w:rsid w:val="4FFF4C1D"/>
+    <w:rsid w:val="500A7091"/>
+    <w:rsid w:val="50341DC1"/>
+    <w:rsid w:val="50E357F0"/>
+    <w:rsid w:val="51280258"/>
+    <w:rsid w:val="52635035"/>
+    <w:rsid w:val="529676B7"/>
+    <w:rsid w:val="52DB3D30"/>
+    <w:rsid w:val="53116E11"/>
+    <w:rsid w:val="53194965"/>
+    <w:rsid w:val="54E44ED6"/>
+    <w:rsid w:val="5B14019A"/>
+    <w:rsid w:val="5E6C6CC6"/>
+    <w:rsid w:val="5F5B78AA"/>
+    <w:rsid w:val="61106997"/>
+    <w:rsid w:val="62587EE5"/>
+    <w:rsid w:val="66D87262"/>
+    <w:rsid w:val="672B5DDC"/>
+    <w:rsid w:val="69417918"/>
+    <w:rsid w:val="69960E98"/>
+    <w:rsid w:val="6E2C4ACE"/>
+    <w:rsid w:val="6EBE0A04"/>
+    <w:rsid w:val="736C2616"/>
+    <w:rsid w:val="748470C9"/>
+    <w:rsid w:val="74AC7227"/>
+    <w:rsid w:val="75756AD4"/>
+    <w:rsid w:val="75C46ADA"/>
+    <w:rsid w:val="75D54ADF"/>
+    <w:rsid w:val="7C4459A1"/>
+    <w:rsid w:val="7DAE3BB3"/>
+  </w:rsids>
+  <m:mathPr>
+    <m:mathFont m:val="Cambria Math"/>
+    <m:brkBin m:val="before"/>
+    <m:brkBinSub m:val="--"/>
+    <m:smallFrac m:val="0"/>
+    <m:dispDef/>
+    <m:lMargin m:val="0"/>
+    <m:rMargin m:val="0"/>
+    <m:defJc m:val="centerGroup"/>
+    <m:wrapIndent m:val="1440"/>
+    <m:intLim m:val="subSup"/>
+    <m:naryLim m:val="undOvr"/>
+  </m:mathPr>
+  <w:themeFontLang w:val="en-US" w:eastAsia="zh-CN"/>
+  <w:clrSchemeMapping w:bg1="light1" w:t1="dark1" w:bg2="light2" w:t2="dark2" w:accent1="accent1" w:accent2="accent2" w:accent3="accent3" w:accent4="accent4" w:accent5="accent5" w:accent6="accent6" w:hyperlink="hyperlink" w:followedHyperlink="followedHyperlink"/>
+  <w:shapeDefaults>
+    <o:shapedefaults v:ext="edit" spidmax="1026"/>
+    <o:shapelayout v:ext="edit">
+      <o:idmap v:ext="edit" data="1"/>
+    </o:shapelayout>
+  </w:shapeDefaults>
+  <w:decimalSymbol w:val="."/>
+  <w:listSeparator w:val=","/>
+  <w14:docId w14:val="7B67161F"/>
+  <w15:docId w15:val="{DA27A00D-07FD-4900-BD02-88D19D7B924D}"/>
+</w:settings>
+</file>
+
+<file path=word\styles.xml><?xml version="1.0" encoding="utf-8"?>
 <w:styles xmlns:mc="http://schemas.openxmlformats.org/markup-compatibility/2006" xmlns:r="http://schemas.openxmlformats.org/officeDocument/2006/relationships" xmlns:w="http://schemas.openxmlformats.org/wordprocessingml/2006/main" xmlns:w14="http://schemas.microsoft.com/office/word/2010/wordml" xmlns:w15="http://schemas.microsoft.com/office/word/2012/wordml" xmlns:w16cex="http://schemas.microsoft.com/office/word/2018/wordml/cex" xmlns:w16cid="http://schemas.microsoft.com/office/word/2016/wordml/cid" xmlns:w16="http://schemas.microsoft.com/office/word/2018/wordml" xmlns:w16du="http://schemas.microsoft.com/office/word/2023/wordml/word16du" xmlns:w16sdtdh="http://schemas.microsoft.com/office/word/2020/wordml/sdtdatahash" xmlns:w16sdtfl="http://schemas.microsoft.com/office/word/2024/wordml/sdtformatlock" xmlns:w16se="http://schemas.microsoft.com/office/word/2015/wordml/symex" mc:Ignorable="w14 w15 w16se w16cid w16 w16cex w16sdtdh w16sdtfl w16du">
   <w:docDefaults>
     <w:rPrDefault>
@@ -8852,7 +9254,7 @@
 </w:styles>
 </file>
 
-<file path=word/theme/theme1.xml><?xml version="1.0" encoding="utf-8"?>
+<file path=word\theme\theme1.xml><?xml version="1.0" encoding="utf-8"?>
 <a:theme xmlns:a="http://schemas.openxmlformats.org/drawingml/2006/main" name="Office Theme">
   <a:themeElements>
     <a:clrScheme name="Office">
@@ -9106,4 +9508,8 @@
   <a:objectDefaults/>
   <a:extraClrSchemeLst/>
 </a:theme>
+</file>
+
+<file path=word\webSettings.xml><?xml version="1.0" encoding="utf-8"?>
+<w:webSettings xmlns:mc="http://schemas.openxmlformats.org/markup-compatibility/2006" xmlns:r="http://schemas.openxmlformats.org/officeDocument/2006/relationships" xmlns:w="http://schemas.openxmlformats.org/wordprocessingml/2006/main" xmlns:w14="http://schemas.microsoft.com/office/word/2010/wordml" xmlns:w15="http://schemas.microsoft.com/office/word/2012/wordml" xmlns:w16cex="http://schemas.microsoft.com/office/word/2018/wordml/cex" xmlns:w16cid="http://schemas.microsoft.com/office/word/2016/wordml/cid" xmlns:w16="http://schemas.microsoft.com/office/word/2018/wordml" xmlns:w16du="http://schemas.microsoft.com/office/word/2023/wordml/word16du" xmlns:w16sdtdh="http://schemas.microsoft.com/office/word/2020/wordml/sdtdatahash" xmlns:w16sdtfl="http://schemas.microsoft.com/office/word/2024/wordml/sdtformatlock" xmlns:w16se="http://schemas.microsoft.com/office/word/2015/wordml/symex" mc:Ignorable="w14 w15 w16se w16cid w16 w16cex w16sdtdh w16sdtfl w16du"/>
 </file>
</xml_diff>